<commit_message>
fix and update Prct№4
</commit_message>
<xml_diff>
--- a/Neural networks and deep learning/Practik№4/Попов Нейросети и глубокое обучение №4.docx
+++ b/Neural networks and deep learning/Practik№4/Попов Нейросети и глубокое обучение №4.docx
@@ -1,6 +1,6 @@
 
 <file path=word/document.xml><?xml version="1.0" encoding="utf-8"?>
-<w:document xmlns:wpc="http://schemas.microsoft.com/office/word/2010/wordprocessingCanvas" xmlns:cx="http://schemas.microsoft.com/office/drawing/2014/chartex" xmlns:cx1="http://schemas.microsoft.com/office/drawing/2015/9/8/chartex" xmlns:cx2="http://schemas.microsoft.com/office/drawing/2015/10/21/chartex" xmlns:cx3="http://schemas.microsoft.com/office/drawing/2016/5/9/chartex" xmlns:cx4="http://schemas.microsoft.com/office/drawing/2016/5/10/chartex" xmlns:cx5="http://schemas.microsoft.com/office/drawing/2016/5/11/chartex" xmlns:cx6="http://schemas.microsoft.com/office/drawing/2016/5/12/chartex" xmlns:cx7="http://schemas.microsoft.com/office/drawing/2016/5/13/chartex" xmlns:cx8="http://schemas.microsoft.com/office/drawing/2016/5/14/chartex" xmlns:mc="http://schemas.openxmlformats.org/markup-compatibility/2006" xmlns:aink="http://schemas.microsoft.com/office/drawing/2016/ink" xmlns:am3d="http://schemas.microsoft.com/office/drawing/2017/model3d" xmlns:o="urn:schemas-microsoft-com:office:office" xmlns:oel="http://schemas.microsoft.com/office/2019/extlst" xmlns:r="http://schemas.openxmlformats.org/officeDocument/2006/relationships" xmlns:m="http://schemas.openxmlformats.org/officeDocument/2006/math" xmlns:v="urn:schemas-microsoft-com:vml" xmlns:wp14="http://schemas.microsoft.com/office/word/2010/wordprocessingDrawing" xmlns:wp="http://schemas.openxmlformats.org/drawingml/2006/wordprocessingDrawing" xmlns:w10="urn:schemas-microsoft-com:office:word" xmlns:w="http://schemas.openxmlformats.org/wordprocessingml/2006/main" xmlns:w14="http://schemas.microsoft.com/office/word/2010/wordml" xmlns:w15="http://schemas.microsoft.com/office/word/2012/wordml" xmlns:w16cex="http://schemas.microsoft.com/office/word/2018/wordml/cex" xmlns:w16cid="http://schemas.microsoft.com/office/word/2016/wordml/cid" xmlns:w16="http://schemas.microsoft.com/office/word/2018/wordml" xmlns:w16sdtdh="http://schemas.microsoft.com/office/word/2020/wordml/sdtdatahash" xmlns:w16se="http://schemas.microsoft.com/office/word/2015/wordml/symex" xmlns:wpg="http://schemas.microsoft.com/office/word/2010/wordprocessingGroup" xmlns:wpi="http://schemas.microsoft.com/office/word/2010/wordprocessingInk" xmlns:wne="http://schemas.microsoft.com/office/word/2006/wordml" xmlns:wps="http://schemas.microsoft.com/office/word/2010/wordprocessingShape" mc:Ignorable="w14 w15 w16se w16cid w16 w16cex w16sdtdh wp14">
+<w:document xmlns:wpc="http://schemas.microsoft.com/office/word/2010/wordprocessingCanvas" xmlns:cx="http://schemas.microsoft.com/office/drawing/2014/chartex" xmlns:mc="http://schemas.openxmlformats.org/markup-compatibility/2006" xmlns:o="urn:schemas-microsoft-com:office:office" xmlns:r="http://schemas.openxmlformats.org/officeDocument/2006/relationships" xmlns:m="http://schemas.openxmlformats.org/officeDocument/2006/math" xmlns:v="urn:schemas-microsoft-com:vml" xmlns:wp14="http://schemas.microsoft.com/office/word/2010/wordprocessingDrawing" xmlns:wp="http://schemas.openxmlformats.org/drawingml/2006/wordprocessingDrawing" xmlns:w10="urn:schemas-microsoft-com:office:word" xmlns:w="http://schemas.openxmlformats.org/wordprocessingml/2006/main" xmlns:w14="http://schemas.microsoft.com/office/word/2010/wordml" xmlns:w15="http://schemas.microsoft.com/office/word/2012/wordml" xmlns:w16se="http://schemas.microsoft.com/office/word/2015/wordml/symex" xmlns:wpg="http://schemas.microsoft.com/office/word/2010/wordprocessingGroup" xmlns:wpi="http://schemas.microsoft.com/office/word/2010/wordprocessingInk" xmlns:wne="http://schemas.microsoft.com/office/word/2006/wordml" xmlns:wps="http://schemas.microsoft.com/office/word/2010/wordprocessingShape" mc:Ignorable="w14 w15 w16se wp14">
   <w:body>
     <w:p>
       <w:pPr>
@@ -499,29 +499,7 @@
           <w:szCs w:val="28"/>
           <w:lang w:eastAsia="ru-RU"/>
         </w:rPr>
-        <w:t xml:space="preserve">по </w:t>
-      </w:r>
-      <w:r>
-        <w:rPr>
-          <w:rFonts w:ascii="Times New Roman" w:eastAsia="Times New Roman" w:hAnsi="Times New Roman" w:cs="Times New Roman"/>
-          <w:caps/>
-          <w:kern w:val="28"/>
-          <w:sz w:val="28"/>
-          <w:szCs w:val="28"/>
-          <w:lang w:eastAsia="ru-RU"/>
-        </w:rPr>
-        <w:t>Практическая работ</w:t>
-      </w:r>
-      <w:r>
-        <w:rPr>
-          <w:rFonts w:ascii="Times New Roman" w:eastAsia="Times New Roman" w:hAnsi="Times New Roman" w:cs="Times New Roman"/>
-          <w:caps/>
-          <w:kern w:val="28"/>
-          <w:sz w:val="28"/>
-          <w:szCs w:val="28"/>
-          <w:lang w:eastAsia="ru-RU"/>
-        </w:rPr>
-        <w:t>е</w:t>
+        <w:t>ПО ПРАКТИЧЕСКОЙ РАБОТЕ</w:t>
       </w:r>
       <w:r>
         <w:rPr>
@@ -1499,6 +1477,3181 @@
           <w:sz w:val="28"/>
           <w:szCs w:val="28"/>
           <w:lang w:val="en-US" w:eastAsia="ru-RU"/>
+        </w:rPr>
+      </w:pPr>
+      <w:r>
+        <w:rPr>
+          <w:noProof/>
+          <w:lang w:eastAsia="ru-RU"/>
+        </w:rPr>
+        <w:drawing>
+          <wp:inline distT="0" distB="0" distL="0" distR="0" wp14:anchorId="61F0EC1B" wp14:editId="729EC409">
+            <wp:extent cx="5505450" cy="1533525"/>
+            <wp:effectExtent l="0" t="0" r="0" b="9525"/>
+            <wp:docPr id="1" name="Рисунок 1"/>
+            <wp:cNvGraphicFramePr>
+              <a:graphicFrameLocks xmlns:a="http://schemas.openxmlformats.org/drawingml/2006/main" noChangeAspect="1"/>
+            </wp:cNvGraphicFramePr>
+            <a:graphic xmlns:a="http://schemas.openxmlformats.org/drawingml/2006/main">
+              <a:graphicData uri="http://schemas.openxmlformats.org/drawingml/2006/picture">
+                <pic:pic xmlns:pic="http://schemas.openxmlformats.org/drawingml/2006/picture">
+                  <pic:nvPicPr>
+                    <pic:cNvPr id="1" name=""/>
+                    <pic:cNvPicPr/>
+                  </pic:nvPicPr>
+                  <pic:blipFill>
+                    <a:blip r:embed="rId6"/>
+                    <a:stretch>
+                      <a:fillRect/>
+                    </a:stretch>
+                  </pic:blipFill>
+                  <pic:spPr>
+                    <a:xfrm>
+                      <a:off x="0" y="0"/>
+                      <a:ext cx="5505450" cy="1533525"/>
+                    </a:xfrm>
+                    <a:prstGeom prst="rect">
+                      <a:avLst/>
+                    </a:prstGeom>
+                  </pic:spPr>
+                </pic:pic>
+              </a:graphicData>
+            </a:graphic>
+          </wp:inline>
+        </w:drawing>
+      </w:r>
+    </w:p>
+    <w:p>
+      <w:pPr>
+        <w:overflowPunct w:val="0"/>
+        <w:autoSpaceDE w:val="0"/>
+        <w:autoSpaceDN w:val="0"/>
+        <w:adjustRightInd w:val="0"/>
+        <w:spacing w:after="0" w:line="240" w:lineRule="auto"/>
+        <w:jc w:val="both"/>
+        <w:textAlignment w:val="baseline"/>
+        <w:rPr>
+          <w:rFonts w:ascii="Times New Roman" w:eastAsia="Times New Roman" w:hAnsi="Times New Roman" w:cs="Times New Roman"/>
+          <w:sz w:val="28"/>
+          <w:szCs w:val="28"/>
+          <w:lang w:val="en-US" w:eastAsia="ru-RU"/>
+        </w:rPr>
+      </w:pPr>
+      <w:r>
+        <w:rPr>
+          <w:noProof/>
+          <w:lang w:eastAsia="ru-RU"/>
+        </w:rPr>
+        <w:drawing>
+          <wp:inline distT="0" distB="0" distL="0" distR="0" wp14:anchorId="7CE5B568" wp14:editId="6E82C6EF">
+            <wp:extent cx="5940425" cy="3001645"/>
+            <wp:effectExtent l="0" t="0" r="3175" b="8255"/>
+            <wp:docPr id="2" name="Рисунок 2"/>
+            <wp:cNvGraphicFramePr>
+              <a:graphicFrameLocks xmlns:a="http://schemas.openxmlformats.org/drawingml/2006/main" noChangeAspect="1"/>
+            </wp:cNvGraphicFramePr>
+            <a:graphic xmlns:a="http://schemas.openxmlformats.org/drawingml/2006/main">
+              <a:graphicData uri="http://schemas.openxmlformats.org/drawingml/2006/picture">
+                <pic:pic xmlns:pic="http://schemas.openxmlformats.org/drawingml/2006/picture">
+                  <pic:nvPicPr>
+                    <pic:cNvPr id="1" name=""/>
+                    <pic:cNvPicPr/>
+                  </pic:nvPicPr>
+                  <pic:blipFill>
+                    <a:blip r:embed="rId7"/>
+                    <a:stretch>
+                      <a:fillRect/>
+                    </a:stretch>
+                  </pic:blipFill>
+                  <pic:spPr>
+                    <a:xfrm>
+                      <a:off x="0" y="0"/>
+                      <a:ext cx="5940425" cy="3001645"/>
+                    </a:xfrm>
+                    <a:prstGeom prst="rect">
+                      <a:avLst/>
+                    </a:prstGeom>
+                  </pic:spPr>
+                </pic:pic>
+              </a:graphicData>
+            </a:graphic>
+          </wp:inline>
+        </w:drawing>
+      </w:r>
+    </w:p>
+    <w:p>
+      <w:pPr>
+        <w:pStyle w:val="ds-markdown-paragraph"/>
+        <w:spacing w:before="0" w:beforeAutospacing="0" w:after="0" w:afterAutospacing="0"/>
+        <w:ind w:firstLine="709"/>
+        <w:jc w:val="both"/>
+        <w:rPr>
+          <w:sz w:val="28"/>
+          <w:szCs w:val="28"/>
+        </w:rPr>
+      </w:pPr>
+      <w:r>
+        <w:rPr>
+          <w:sz w:val="28"/>
+          <w:szCs w:val="28"/>
+        </w:rPr>
+        <w:t xml:space="preserve">Реализация сети Хэмминга </w:t>
+      </w:r>
+      <w:proofErr w:type="spellStart"/>
+      <w:r>
+        <w:rPr>
+          <w:sz w:val="28"/>
+          <w:szCs w:val="28"/>
+        </w:rPr>
+        <w:t>аппаратно</w:t>
+      </w:r>
+      <w:proofErr w:type="spellEnd"/>
+      <w:r>
+        <w:rPr>
+          <w:sz w:val="28"/>
+          <w:szCs w:val="28"/>
+        </w:rPr>
+        <w:t xml:space="preserve"> в </w:t>
+      </w:r>
+      <w:proofErr w:type="spellStart"/>
+      <w:r>
+        <w:rPr>
+          <w:sz w:val="28"/>
+          <w:szCs w:val="28"/>
+        </w:rPr>
+        <w:t>Electronics</w:t>
+      </w:r>
+      <w:proofErr w:type="spellEnd"/>
+      <w:r>
+        <w:rPr>
+          <w:sz w:val="28"/>
+          <w:szCs w:val="28"/>
+        </w:rPr>
+        <w:t xml:space="preserve"> </w:t>
+      </w:r>
+      <w:proofErr w:type="spellStart"/>
+      <w:r>
+        <w:rPr>
+          <w:sz w:val="28"/>
+          <w:szCs w:val="28"/>
+        </w:rPr>
+        <w:t>Workbench</w:t>
+      </w:r>
+      <w:proofErr w:type="spellEnd"/>
+      <w:r>
+        <w:rPr>
+          <w:sz w:val="28"/>
+          <w:szCs w:val="28"/>
+        </w:rPr>
+        <w:t xml:space="preserve"> (EWB/</w:t>
+      </w:r>
+      <w:proofErr w:type="spellStart"/>
+      <w:r>
+        <w:rPr>
+          <w:sz w:val="28"/>
+          <w:szCs w:val="28"/>
+        </w:rPr>
+        <w:t>Multisim</w:t>
+      </w:r>
+      <w:proofErr w:type="spellEnd"/>
+      <w:r>
+        <w:rPr>
+          <w:sz w:val="28"/>
+          <w:szCs w:val="28"/>
+        </w:rPr>
+        <w:t>) требует создания схемы из двух частей: </w:t>
+      </w:r>
+      <w:r>
+        <w:rPr>
+          <w:rStyle w:val="a6"/>
+          <w:sz w:val="28"/>
+          <w:szCs w:val="28"/>
+        </w:rPr>
+        <w:t>Вычислителя скалярных произведений (Слой 1)</w:t>
+      </w:r>
+      <w:r>
+        <w:rPr>
+          <w:sz w:val="28"/>
+          <w:szCs w:val="28"/>
+        </w:rPr>
+        <w:t> и </w:t>
+      </w:r>
+      <w:r>
+        <w:rPr>
+          <w:rStyle w:val="a6"/>
+          <w:sz w:val="28"/>
+          <w:szCs w:val="28"/>
+        </w:rPr>
+        <w:t>MAXNET (Слой 2)</w:t>
+      </w:r>
+      <w:r>
+        <w:rPr>
+          <w:sz w:val="28"/>
+          <w:szCs w:val="28"/>
+        </w:rPr>
+        <w:t>.</w:t>
+      </w:r>
+    </w:p>
+    <w:p>
+      <w:pPr>
+        <w:pStyle w:val="4"/>
+        <w:spacing w:before="0" w:line="240" w:lineRule="auto"/>
+        <w:ind w:firstLine="709"/>
+        <w:jc w:val="both"/>
+        <w:rPr>
+          <w:rFonts w:ascii="Times New Roman" w:hAnsi="Times New Roman" w:cs="Times New Roman"/>
+          <w:i w:val="0"/>
+          <w:color w:val="auto"/>
+          <w:sz w:val="28"/>
+          <w:szCs w:val="28"/>
+        </w:rPr>
+      </w:pPr>
+      <w:r>
+        <w:rPr>
+          <w:rFonts w:ascii="Times New Roman" w:hAnsi="Times New Roman" w:cs="Times New Roman"/>
+          <w:i w:val="0"/>
+          <w:color w:val="auto"/>
+          <w:sz w:val="28"/>
+          <w:szCs w:val="28"/>
+        </w:rPr>
+        <w:t>Схема реализации</w:t>
+      </w:r>
+    </w:p>
+    <w:p>
+      <w:pPr>
+        <w:pStyle w:val="ds-markdown-paragraph"/>
+        <w:numPr>
+          <w:ilvl w:val="0"/>
+          <w:numId w:val="38"/>
+        </w:numPr>
+        <w:spacing w:before="0" w:beforeAutospacing="0" w:after="0" w:afterAutospacing="0"/>
+        <w:ind w:left="0" w:firstLine="709"/>
+        <w:jc w:val="both"/>
+        <w:rPr>
+          <w:sz w:val="28"/>
+          <w:szCs w:val="28"/>
+        </w:rPr>
+      </w:pPr>
+      <w:r>
+        <w:rPr>
+          <w:rStyle w:val="a6"/>
+          <w:sz w:val="28"/>
+          <w:szCs w:val="28"/>
+        </w:rPr>
+        <w:t>Входной слой:</w:t>
+      </w:r>
+      <w:r>
+        <w:rPr>
+          <w:sz w:val="28"/>
+          <w:szCs w:val="28"/>
+        </w:rPr>
+        <w:t> 9 источников напряжения (V1... V9), представляющих бинарное изображение 3x3 (0V или +5V).</w:t>
+      </w:r>
+    </w:p>
+    <w:p>
+      <w:pPr>
+        <w:pStyle w:val="ds-markdown-paragraph"/>
+        <w:numPr>
+          <w:ilvl w:val="0"/>
+          <w:numId w:val="38"/>
+        </w:numPr>
+        <w:spacing w:before="0" w:beforeAutospacing="0" w:after="0" w:afterAutospacing="0"/>
+        <w:ind w:left="0" w:firstLine="709"/>
+        <w:jc w:val="both"/>
+        <w:rPr>
+          <w:sz w:val="28"/>
+          <w:szCs w:val="28"/>
+        </w:rPr>
+      </w:pPr>
+      <w:r>
+        <w:rPr>
+          <w:rStyle w:val="a6"/>
+          <w:sz w:val="28"/>
+          <w:szCs w:val="28"/>
+        </w:rPr>
+        <w:t>Слой Хэмминга (Вычислитель):</w:t>
+      </w:r>
+    </w:p>
+    <w:p>
+      <w:pPr>
+        <w:pStyle w:val="ds-markdown-paragraph"/>
+        <w:numPr>
+          <w:ilvl w:val="1"/>
+          <w:numId w:val="38"/>
+        </w:numPr>
+        <w:spacing w:before="0" w:beforeAutospacing="0" w:after="0" w:afterAutospacing="0"/>
+        <w:ind w:left="0" w:firstLine="709"/>
+        <w:jc w:val="both"/>
+        <w:rPr>
+          <w:sz w:val="28"/>
+          <w:szCs w:val="28"/>
+        </w:rPr>
+      </w:pPr>
+      <w:r>
+        <w:rPr>
+          <w:sz w:val="28"/>
+          <w:szCs w:val="28"/>
+        </w:rPr>
+        <w:t>Для каждого из трех эталонов (L, T, X) собирается схема взвешенного сумматора на операционном усилителе (ОУ).</w:t>
+      </w:r>
+    </w:p>
+    <w:p>
+      <w:pPr>
+        <w:pStyle w:val="ds-markdown-paragraph"/>
+        <w:numPr>
+          <w:ilvl w:val="1"/>
+          <w:numId w:val="38"/>
+        </w:numPr>
+        <w:spacing w:before="0" w:beforeAutospacing="0" w:after="0" w:afterAutospacing="0"/>
+        <w:ind w:left="0" w:firstLine="709"/>
+        <w:jc w:val="both"/>
+        <w:rPr>
+          <w:sz w:val="28"/>
+          <w:szCs w:val="28"/>
+        </w:rPr>
+      </w:pPr>
+      <w:r>
+        <w:rPr>
+          <w:rStyle w:val="a6"/>
+          <w:sz w:val="28"/>
+          <w:szCs w:val="28"/>
+        </w:rPr>
+        <w:t>Веса (синапсы):</w:t>
+      </w:r>
+      <w:r>
+        <w:rPr>
+          <w:sz w:val="28"/>
+          <w:szCs w:val="28"/>
+        </w:rPr>
+        <w:t> Реализуются с помощью резисторов. Если в эталоне +1 (черный) — ставим резистор с проводимостью G. Если -1 (белый) — ставим резистор с обратной проводимостью или инвертируем сигнал через ОУ.</w:t>
+      </w:r>
+    </w:p>
+    <w:p>
+      <w:pPr>
+        <w:pStyle w:val="ds-markdown-paragraph"/>
+        <w:numPr>
+          <w:ilvl w:val="1"/>
+          <w:numId w:val="38"/>
+        </w:numPr>
+        <w:spacing w:before="0" w:beforeAutospacing="0" w:after="0" w:afterAutospacing="0"/>
+        <w:ind w:left="0" w:firstLine="709"/>
+        <w:jc w:val="both"/>
+        <w:rPr>
+          <w:sz w:val="28"/>
+          <w:szCs w:val="28"/>
+        </w:rPr>
+      </w:pPr>
+      <w:r>
+        <w:rPr>
+          <w:rStyle w:val="a7"/>
+          <w:b/>
+          <w:i w:val="0"/>
+          <w:sz w:val="28"/>
+          <w:szCs w:val="28"/>
+        </w:rPr>
+        <w:t xml:space="preserve">Альтернатива </w:t>
+      </w:r>
+      <w:proofErr w:type="spellStart"/>
+      <w:r>
+        <w:rPr>
+          <w:rStyle w:val="a7"/>
+          <w:b/>
+          <w:i w:val="0"/>
+          <w:sz w:val="28"/>
+          <w:szCs w:val="28"/>
+        </w:rPr>
+        <w:t>мемристорам</w:t>
+      </w:r>
+      <w:proofErr w:type="spellEnd"/>
+      <w:r>
+        <w:rPr>
+          <w:rStyle w:val="a7"/>
+          <w:b/>
+          <w:i w:val="0"/>
+          <w:sz w:val="28"/>
+          <w:szCs w:val="28"/>
+        </w:rPr>
+        <w:t>:</w:t>
+      </w:r>
+      <w:r>
+        <w:rPr>
+          <w:b/>
+          <w:i/>
+          <w:sz w:val="28"/>
+          <w:szCs w:val="28"/>
+        </w:rPr>
+        <w:t> </w:t>
+      </w:r>
+      <w:proofErr w:type="gramStart"/>
+      <w:r>
+        <w:rPr>
+          <w:sz w:val="28"/>
+          <w:szCs w:val="28"/>
+        </w:rPr>
+        <w:t>В</w:t>
+      </w:r>
+      <w:proofErr w:type="gramEnd"/>
+      <w:r>
+        <w:rPr>
+          <w:sz w:val="28"/>
+          <w:szCs w:val="28"/>
+        </w:rPr>
+        <w:t xml:space="preserve"> </w:t>
+      </w:r>
+      <w:r>
+        <w:rPr>
+          <w:sz w:val="28"/>
+          <w:szCs w:val="28"/>
+        </w:rPr>
+        <w:t xml:space="preserve">среде EWB можно имитировать веса </w:t>
+      </w:r>
+      <w:proofErr w:type="spellStart"/>
+      <w:r>
+        <w:rPr>
+          <w:sz w:val="28"/>
+          <w:szCs w:val="28"/>
+        </w:rPr>
+        <w:t>подстроечными</w:t>
+      </w:r>
+      <w:proofErr w:type="spellEnd"/>
+      <w:r>
+        <w:rPr>
+          <w:sz w:val="28"/>
+          <w:szCs w:val="28"/>
+        </w:rPr>
+        <w:t xml:space="preserve"> резисторами. Чтобы промоделировать "</w:t>
+      </w:r>
+      <w:proofErr w:type="spellStart"/>
+      <w:r>
+        <w:rPr>
+          <w:sz w:val="28"/>
+          <w:szCs w:val="28"/>
+        </w:rPr>
+        <w:t>мемристорную</w:t>
+      </w:r>
+      <w:proofErr w:type="spellEnd"/>
+      <w:r>
+        <w:rPr>
+          <w:sz w:val="28"/>
+          <w:szCs w:val="28"/>
+        </w:rPr>
+        <w:t>" матрицу, можно использовать управляемые сопротивления, значение которых зависит от напряжения на затворе (JFET транзисторы).</w:t>
+      </w:r>
+    </w:p>
+    <w:p>
+      <w:pPr>
+        <w:pStyle w:val="ds-markdown-paragraph"/>
+        <w:numPr>
+          <w:ilvl w:val="1"/>
+          <w:numId w:val="38"/>
+        </w:numPr>
+        <w:spacing w:before="0" w:beforeAutospacing="0" w:after="0" w:afterAutospacing="0"/>
+        <w:ind w:left="0" w:firstLine="709"/>
+        <w:jc w:val="both"/>
+        <w:rPr>
+          <w:sz w:val="28"/>
+          <w:szCs w:val="28"/>
+        </w:rPr>
+      </w:pPr>
+      <w:r>
+        <w:rPr>
+          <w:sz w:val="28"/>
+          <w:szCs w:val="28"/>
+        </w:rPr>
+        <w:t>На выходе каждого сумматора получаем аналоговое напряжение </w:t>
+      </w:r>
+      <w:proofErr w:type="spellStart"/>
+      <w:r>
+        <w:rPr>
+          <w:rStyle w:val="katex-mathml"/>
+          <w:sz w:val="28"/>
+          <w:szCs w:val="28"/>
+          <w:bdr w:val="none" w:sz="0" w:space="0" w:color="auto" w:frame="1"/>
+        </w:rPr>
+        <w:t>Vj</w:t>
+      </w:r>
+      <w:proofErr w:type="spellEnd"/>
+      <w:r>
+        <w:rPr>
+          <w:rStyle w:val="katex-mathml"/>
+          <w:sz w:val="28"/>
+          <w:szCs w:val="28"/>
+          <w:bdr w:val="none" w:sz="0" w:space="0" w:color="auto" w:frame="1"/>
+        </w:rPr>
+        <w:t>,</w:t>
+      </w:r>
+      <w:r>
+        <w:rPr>
+          <w:sz w:val="28"/>
+          <w:szCs w:val="28"/>
+        </w:rPr>
+        <w:t xml:space="preserve"> пропорциональное сходству.</w:t>
+      </w:r>
+    </w:p>
+    <w:p>
+      <w:pPr>
+        <w:pStyle w:val="ds-markdown-paragraph"/>
+        <w:spacing w:before="0" w:beforeAutospacing="0" w:after="0" w:afterAutospacing="0"/>
+        <w:ind w:left="709"/>
+        <w:jc w:val="both"/>
+        <w:rPr>
+          <w:sz w:val="28"/>
+          <w:szCs w:val="28"/>
+        </w:rPr>
+      </w:pPr>
+    </w:p>
+    <w:p>
+      <w:pPr>
+        <w:pStyle w:val="ds-markdown-paragraph"/>
+        <w:numPr>
+          <w:ilvl w:val="0"/>
+          <w:numId w:val="38"/>
+        </w:numPr>
+        <w:spacing w:before="0" w:beforeAutospacing="0" w:after="0" w:afterAutospacing="0"/>
+        <w:ind w:left="0" w:firstLine="709"/>
+        <w:jc w:val="both"/>
+        <w:rPr>
+          <w:sz w:val="28"/>
+          <w:szCs w:val="28"/>
+        </w:rPr>
+      </w:pPr>
+      <w:r>
+        <w:rPr>
+          <w:rStyle w:val="a6"/>
+          <w:sz w:val="28"/>
+          <w:szCs w:val="28"/>
+        </w:rPr>
+        <w:lastRenderedPageBreak/>
+        <w:t>MAXNET (Слой выделения максимума):</w:t>
+      </w:r>
+    </w:p>
+    <w:p>
+      <w:pPr>
+        <w:pStyle w:val="ds-markdown-paragraph"/>
+        <w:numPr>
+          <w:ilvl w:val="1"/>
+          <w:numId w:val="38"/>
+        </w:numPr>
+        <w:spacing w:before="0" w:beforeAutospacing="0" w:after="0" w:afterAutospacing="0"/>
+        <w:ind w:left="0" w:firstLine="709"/>
+        <w:jc w:val="both"/>
+        <w:rPr>
+          <w:sz w:val="28"/>
+          <w:szCs w:val="28"/>
+        </w:rPr>
+      </w:pPr>
+      <w:r>
+        <w:rPr>
+          <w:sz w:val="28"/>
+          <w:szCs w:val="28"/>
+        </w:rPr>
+        <w:t>Строится на 3-х операционных усилителях.</w:t>
+      </w:r>
+    </w:p>
+    <w:p>
+      <w:pPr>
+        <w:pStyle w:val="ds-markdown-paragraph"/>
+        <w:numPr>
+          <w:ilvl w:val="1"/>
+          <w:numId w:val="38"/>
+        </w:numPr>
+        <w:spacing w:before="0" w:beforeAutospacing="0" w:after="0" w:afterAutospacing="0"/>
+        <w:ind w:left="0" w:firstLine="709"/>
+        <w:jc w:val="both"/>
+        <w:rPr>
+          <w:sz w:val="28"/>
+          <w:szCs w:val="28"/>
+        </w:rPr>
+      </w:pPr>
+      <w:r>
+        <w:rPr>
+          <w:sz w:val="28"/>
+          <w:szCs w:val="28"/>
+        </w:rPr>
+        <w:t>Каждый усилитель имеет положительную обратную связь (</w:t>
+      </w:r>
+      <w:proofErr w:type="spellStart"/>
+      <w:r>
+        <w:rPr>
+          <w:sz w:val="28"/>
+          <w:szCs w:val="28"/>
+        </w:rPr>
+        <w:t>самоподдержание</w:t>
+      </w:r>
+      <w:proofErr w:type="spellEnd"/>
+      <w:r>
+        <w:rPr>
+          <w:sz w:val="28"/>
+          <w:szCs w:val="28"/>
+        </w:rPr>
+        <w:t>) через резистор </w:t>
+      </w:r>
+      <w:proofErr w:type="spellStart"/>
+      <w:r>
+        <w:rPr>
+          <w:rStyle w:val="katex-mathml"/>
+          <w:sz w:val="28"/>
+          <w:szCs w:val="28"/>
+          <w:bdr w:val="none" w:sz="0" w:space="0" w:color="auto" w:frame="1"/>
+        </w:rPr>
+        <w:t>Rf</w:t>
+      </w:r>
+      <w:proofErr w:type="spellEnd"/>
+      <w:r>
+        <w:rPr>
+          <w:rStyle w:val="vlist-s"/>
+          <w:sz w:val="28"/>
+          <w:szCs w:val="28"/>
+        </w:rPr>
+        <w:t>​</w:t>
+      </w:r>
+      <w:r>
+        <w:rPr>
+          <w:sz w:val="28"/>
+          <w:szCs w:val="28"/>
+        </w:rPr>
+        <w:t>, и отрицательные связи на соседние каналы через резисторы </w:t>
+      </w:r>
+      <w:proofErr w:type="spellStart"/>
+      <w:r>
+        <w:rPr>
+          <w:rStyle w:val="katex-mathml"/>
+          <w:sz w:val="28"/>
+          <w:szCs w:val="28"/>
+          <w:bdr w:val="none" w:sz="0" w:space="0" w:color="auto" w:frame="1"/>
+        </w:rPr>
+        <w:t>Rla</w:t>
+      </w:r>
+      <w:proofErr w:type="spellEnd"/>
+      <w:r>
+        <w:rPr>
+          <w:rStyle w:val="katex-mathml"/>
+          <w:sz w:val="28"/>
+          <w:szCs w:val="28"/>
+          <w:bdr w:val="none" w:sz="0" w:space="0" w:color="auto" w:frame="1"/>
+          <w:lang w:val="en-US"/>
+        </w:rPr>
+        <w:t>t</w:t>
+      </w:r>
+      <w:r>
+        <w:rPr>
+          <w:rStyle w:val="vlist-s"/>
+          <w:sz w:val="28"/>
+          <w:szCs w:val="28"/>
+        </w:rPr>
+        <w:t>​</w:t>
+      </w:r>
+      <w:r>
+        <w:rPr>
+          <w:sz w:val="28"/>
+          <w:szCs w:val="28"/>
+        </w:rPr>
+        <w:t> (латеральное торможение).</w:t>
+      </w:r>
+    </w:p>
+    <w:p>
+      <w:pPr>
+        <w:pStyle w:val="ds-markdown-paragraph"/>
+        <w:numPr>
+          <w:ilvl w:val="1"/>
+          <w:numId w:val="38"/>
+        </w:numPr>
+        <w:spacing w:before="0" w:beforeAutospacing="0" w:after="0" w:afterAutospacing="0"/>
+        <w:ind w:left="0" w:firstLine="709"/>
+        <w:jc w:val="both"/>
+        <w:rPr>
+          <w:sz w:val="28"/>
+          <w:szCs w:val="28"/>
+        </w:rPr>
+      </w:pPr>
+      <w:r>
+        <w:rPr>
+          <w:sz w:val="28"/>
+          <w:szCs w:val="28"/>
+        </w:rPr>
+        <w:t>Соотношение сопротивлений задает коэффициент </w:t>
+      </w:r>
+      <w:r>
+        <w:rPr>
+          <w:rStyle w:val="katex-mathml"/>
+          <w:sz w:val="28"/>
+          <w:szCs w:val="28"/>
+          <w:bdr w:val="none" w:sz="0" w:space="0" w:color="auto" w:frame="1"/>
+        </w:rPr>
+        <w:t>ϵ</w:t>
+      </w:r>
+      <w:r>
+        <w:rPr>
+          <w:sz w:val="28"/>
+          <w:szCs w:val="28"/>
+        </w:rPr>
+        <w:t>. </w:t>
+      </w:r>
+      <w:r>
+        <w:rPr>
+          <w:rStyle w:val="katex-mathml"/>
+          <w:sz w:val="28"/>
+          <w:szCs w:val="28"/>
+          <w:bdr w:val="none" w:sz="0" w:space="0" w:color="auto" w:frame="1"/>
+        </w:rPr>
+        <w:t>ϵ=</w:t>
+      </w:r>
+      <w:proofErr w:type="spellStart"/>
+      <w:r>
+        <w:rPr>
+          <w:rStyle w:val="katex-mathml"/>
+          <w:sz w:val="28"/>
+          <w:szCs w:val="28"/>
+          <w:bdr w:val="none" w:sz="0" w:space="0" w:color="auto" w:frame="1"/>
+        </w:rPr>
+        <w:t>Rобр.связи</w:t>
+      </w:r>
+      <w:proofErr w:type="spellEnd"/>
+      <w:r>
+        <w:rPr>
+          <w:rStyle w:val="katex-mathml"/>
+          <w:sz w:val="28"/>
+          <w:szCs w:val="28"/>
+          <w:bdr w:val="none" w:sz="0" w:space="0" w:color="auto" w:frame="1"/>
+        </w:rPr>
+        <w:t>/</w:t>
+      </w:r>
+      <w:proofErr w:type="spellStart"/>
+      <w:r>
+        <w:rPr>
+          <w:rStyle w:val="katex-mathml"/>
+          <w:sz w:val="28"/>
+          <w:szCs w:val="28"/>
+          <w:bdr w:val="none" w:sz="0" w:space="0" w:color="auto" w:frame="1"/>
+        </w:rPr>
+        <w:t>Rвх</w:t>
+      </w:r>
+      <w:proofErr w:type="spellEnd"/>
+      <w:r>
+        <w:rPr>
+          <w:rStyle w:val="vlist-s"/>
+          <w:sz w:val="28"/>
+          <w:szCs w:val="28"/>
+        </w:rPr>
+        <w:t>​</w:t>
+      </w:r>
+      <w:r>
+        <w:rPr>
+          <w:sz w:val="28"/>
+          <w:szCs w:val="28"/>
+        </w:rPr>
+        <w:t>. Обычно </w:t>
+      </w:r>
+      <w:r>
+        <w:rPr>
+          <w:rStyle w:val="katex-mathml"/>
+          <w:sz w:val="28"/>
+          <w:szCs w:val="28"/>
+          <w:bdr w:val="none" w:sz="0" w:space="0" w:color="auto" w:frame="1"/>
+        </w:rPr>
+        <w:t>ϵ</w:t>
+      </w:r>
+      <w:r>
+        <w:rPr>
+          <w:sz w:val="28"/>
+          <w:szCs w:val="28"/>
+        </w:rPr>
+        <w:t> выбирают малым (например, </w:t>
+      </w:r>
+      <w:r>
+        <w:rPr>
+          <w:rStyle w:val="katex-mathml"/>
+          <w:sz w:val="28"/>
+          <w:szCs w:val="28"/>
+          <w:bdr w:val="none" w:sz="0" w:space="0" w:color="auto" w:frame="1"/>
+        </w:rPr>
+        <w:t>0.1</w:t>
+      </w:r>
+      <w:r>
+        <w:rPr>
+          <w:rStyle w:val="mord"/>
+          <w:sz w:val="28"/>
+          <w:szCs w:val="28"/>
+        </w:rPr>
+        <w:t>0.1</w:t>
+      </w:r>
+      <w:r>
+        <w:rPr>
+          <w:sz w:val="28"/>
+          <w:szCs w:val="28"/>
+        </w:rPr>
+        <w:t>).</w:t>
+      </w:r>
+    </w:p>
+    <w:p>
+      <w:pPr>
+        <w:pStyle w:val="4"/>
+        <w:spacing w:before="0" w:line="240" w:lineRule="auto"/>
+        <w:ind w:firstLine="709"/>
+        <w:jc w:val="both"/>
+        <w:rPr>
+          <w:rFonts w:ascii="Times New Roman" w:hAnsi="Times New Roman" w:cs="Times New Roman"/>
+          <w:color w:val="auto"/>
+          <w:sz w:val="28"/>
+          <w:szCs w:val="28"/>
+        </w:rPr>
+      </w:pPr>
+      <w:r>
+        <w:rPr>
+          <w:rFonts w:ascii="Times New Roman" w:hAnsi="Times New Roman" w:cs="Times New Roman"/>
+          <w:color w:val="auto"/>
+          <w:sz w:val="28"/>
+          <w:szCs w:val="28"/>
+        </w:rPr>
+        <w:t>Анализ полученных результатов</w:t>
+      </w:r>
+    </w:p>
+    <w:p>
+      <w:pPr>
+        <w:pStyle w:val="ds-markdown-paragraph"/>
+        <w:spacing w:before="0" w:beforeAutospacing="0" w:after="0" w:afterAutospacing="0"/>
+        <w:ind w:firstLine="709"/>
+        <w:jc w:val="both"/>
+        <w:rPr>
+          <w:sz w:val="28"/>
+          <w:szCs w:val="28"/>
+        </w:rPr>
+      </w:pPr>
+      <w:r>
+        <w:rPr>
+          <w:sz w:val="28"/>
+          <w:szCs w:val="28"/>
+        </w:rPr>
+        <w:t>При моделировании в EWB можно наблюдать следующее:</w:t>
+      </w:r>
+    </w:p>
+    <w:p>
+      <w:pPr>
+        <w:pStyle w:val="ds-markdown-paragraph"/>
+        <w:numPr>
+          <w:ilvl w:val="0"/>
+          <w:numId w:val="39"/>
+        </w:numPr>
+        <w:spacing w:before="0" w:beforeAutospacing="0" w:after="0" w:afterAutospacing="0"/>
+        <w:ind w:left="0" w:firstLine="709"/>
+        <w:jc w:val="both"/>
+        <w:rPr>
+          <w:sz w:val="28"/>
+          <w:szCs w:val="28"/>
+        </w:rPr>
+      </w:pPr>
+      <w:r>
+        <w:rPr>
+          <w:rStyle w:val="a6"/>
+          <w:sz w:val="28"/>
+          <w:szCs w:val="28"/>
+        </w:rPr>
+        <w:t>Динамика MAXNET:</w:t>
+      </w:r>
+      <w:r>
+        <w:rPr>
+          <w:sz w:val="28"/>
+          <w:szCs w:val="28"/>
+        </w:rPr>
+        <w:t> При подаче зашумленного символа "T" на вход, на первом слое появятся напряжения:</w:t>
+      </w:r>
+    </w:p>
+    <w:p>
+      <w:pPr>
+        <w:pStyle w:val="ds-markdown-paragraph"/>
+        <w:numPr>
+          <w:ilvl w:val="1"/>
+          <w:numId w:val="39"/>
+        </w:numPr>
+        <w:spacing w:before="0" w:beforeAutospacing="0" w:after="0" w:afterAutospacing="0"/>
+        <w:ind w:left="0" w:firstLine="709"/>
+        <w:jc w:val="both"/>
+        <w:rPr>
+          <w:sz w:val="28"/>
+          <w:szCs w:val="28"/>
+        </w:rPr>
+      </w:pPr>
+      <w:r>
+        <w:rPr>
+          <w:rStyle w:val="katex-mathml"/>
+          <w:sz w:val="28"/>
+          <w:szCs w:val="28"/>
+          <w:bdr w:val="none" w:sz="0" w:space="0" w:color="auto" w:frame="1"/>
+        </w:rPr>
+        <w:t>VL=2.5B</w:t>
+      </w:r>
+    </w:p>
+    <w:p>
+      <w:pPr>
+        <w:pStyle w:val="ds-markdown-paragraph"/>
+        <w:numPr>
+          <w:ilvl w:val="1"/>
+          <w:numId w:val="39"/>
+        </w:numPr>
+        <w:spacing w:before="0" w:beforeAutospacing="0" w:after="0" w:afterAutospacing="0"/>
+        <w:ind w:left="0" w:firstLine="709"/>
+        <w:jc w:val="both"/>
+        <w:rPr>
+          <w:sz w:val="28"/>
+          <w:szCs w:val="28"/>
+        </w:rPr>
+      </w:pPr>
+      <w:r>
+        <w:rPr>
+          <w:rStyle w:val="katex-mathml"/>
+          <w:sz w:val="28"/>
+          <w:szCs w:val="28"/>
+          <w:bdr w:val="none" w:sz="0" w:space="0" w:color="auto" w:frame="1"/>
+        </w:rPr>
+        <w:t>VT=6.2B</w:t>
+      </w:r>
+      <w:r>
+        <w:rPr>
+          <w:sz w:val="28"/>
+          <w:szCs w:val="28"/>
+        </w:rPr>
+        <w:t> (максимальное)</w:t>
+      </w:r>
+    </w:p>
+    <w:p>
+      <w:pPr>
+        <w:pStyle w:val="ds-markdown-paragraph"/>
+        <w:numPr>
+          <w:ilvl w:val="1"/>
+          <w:numId w:val="39"/>
+        </w:numPr>
+        <w:spacing w:before="0" w:beforeAutospacing="0" w:after="0" w:afterAutospacing="0"/>
+        <w:ind w:left="0" w:firstLine="709"/>
+        <w:jc w:val="both"/>
+        <w:rPr>
+          <w:sz w:val="28"/>
+          <w:szCs w:val="28"/>
+        </w:rPr>
+      </w:pPr>
+      <w:r>
+        <w:rPr>
+          <w:rStyle w:val="katex-mathml"/>
+          <w:sz w:val="28"/>
+          <w:szCs w:val="28"/>
+          <w:bdr w:val="none" w:sz="0" w:space="0" w:color="auto" w:frame="1"/>
+        </w:rPr>
+        <w:t>VX=1.1B</w:t>
+      </w:r>
+    </w:p>
+    <w:p>
+      <w:pPr>
+        <w:pStyle w:val="ds-markdown-paragraph"/>
+        <w:numPr>
+          <w:ilvl w:val="1"/>
+          <w:numId w:val="39"/>
+        </w:numPr>
+        <w:spacing w:before="0" w:beforeAutospacing="0" w:after="0" w:afterAutospacing="0"/>
+        <w:ind w:left="0" w:firstLine="709"/>
+        <w:jc w:val="both"/>
+        <w:rPr>
+          <w:sz w:val="28"/>
+          <w:szCs w:val="28"/>
+        </w:rPr>
+      </w:pPr>
+      <w:r>
+        <w:rPr>
+          <w:sz w:val="28"/>
+          <w:szCs w:val="28"/>
+        </w:rPr>
+        <w:t xml:space="preserve">Подключая осциллограф к выходам MAXNET, можно увидеть, как сигнал канала T растет, а сигналы L и X экспоненциально затухают до нуля. Через 5-10 микросекунд (зависит </w:t>
+      </w:r>
+      <w:r>
+        <w:rPr>
+          <w:sz w:val="28"/>
+          <w:szCs w:val="28"/>
+        </w:rPr>
+        <w:t>от постоянного времени</w:t>
+      </w:r>
+      <w:r>
+        <w:rPr>
+          <w:sz w:val="28"/>
+          <w:szCs w:val="28"/>
+        </w:rPr>
+        <w:t xml:space="preserve"> ОУ) устанавливается единственный активный выход — </w:t>
+      </w:r>
+      <w:r>
+        <w:rPr>
+          <w:rStyle w:val="a6"/>
+          <w:sz w:val="28"/>
+          <w:szCs w:val="28"/>
+        </w:rPr>
+        <w:t>T</w:t>
+      </w:r>
+      <w:r>
+        <w:rPr>
+          <w:sz w:val="28"/>
+          <w:szCs w:val="28"/>
+        </w:rPr>
+        <w:t>.</w:t>
+      </w:r>
+    </w:p>
+    <w:p>
+      <w:pPr>
+        <w:pStyle w:val="ds-markdown-paragraph"/>
+        <w:numPr>
+          <w:ilvl w:val="0"/>
+          <w:numId w:val="39"/>
+        </w:numPr>
+        <w:spacing w:before="0" w:beforeAutospacing="0" w:after="0" w:afterAutospacing="0"/>
+        <w:ind w:left="0" w:firstLine="709"/>
+        <w:jc w:val="both"/>
+        <w:rPr>
+          <w:sz w:val="28"/>
+          <w:szCs w:val="28"/>
+        </w:rPr>
+      </w:pPr>
+      <w:r>
+        <w:rPr>
+          <w:rStyle w:val="a6"/>
+          <w:sz w:val="28"/>
+          <w:szCs w:val="28"/>
+        </w:rPr>
+        <w:t xml:space="preserve">Эффект </w:t>
+      </w:r>
+      <w:proofErr w:type="spellStart"/>
+      <w:r>
+        <w:rPr>
+          <w:rStyle w:val="a6"/>
+          <w:sz w:val="28"/>
+          <w:szCs w:val="28"/>
+        </w:rPr>
+        <w:t>мемристора</w:t>
+      </w:r>
+      <w:proofErr w:type="spellEnd"/>
+      <w:r>
+        <w:rPr>
+          <w:rStyle w:val="a6"/>
+          <w:sz w:val="28"/>
+          <w:szCs w:val="28"/>
+        </w:rPr>
+        <w:t>:</w:t>
+      </w:r>
+      <w:r>
+        <w:rPr>
+          <w:sz w:val="28"/>
+          <w:szCs w:val="28"/>
+        </w:rPr>
+        <w:t xml:space="preserve"> Если в схеме вместо обычных резисторов используются виртуальные </w:t>
+      </w:r>
+      <w:proofErr w:type="spellStart"/>
+      <w:r>
+        <w:rPr>
+          <w:sz w:val="28"/>
+          <w:szCs w:val="28"/>
+        </w:rPr>
+        <w:t>мемристоры</w:t>
+      </w:r>
+      <w:proofErr w:type="spellEnd"/>
+      <w:r>
+        <w:rPr>
+          <w:sz w:val="28"/>
+          <w:szCs w:val="28"/>
+        </w:rPr>
+        <w:t>, можно подать импульс напряжения на "запись", изменив их сопротивление. После отключения питания и повторном включении веса останутся теми же. Это доказывает концепцию </w:t>
+      </w:r>
+      <w:r>
+        <w:rPr>
+          <w:rStyle w:val="a6"/>
+          <w:sz w:val="28"/>
+          <w:szCs w:val="28"/>
+        </w:rPr>
+        <w:t>энергонезависимого обучения</w:t>
+      </w:r>
+      <w:r>
+        <w:rPr>
+          <w:sz w:val="28"/>
+          <w:szCs w:val="28"/>
+        </w:rPr>
+        <w:t xml:space="preserve">: сеть обучается однократно (прожиганием </w:t>
+      </w:r>
+      <w:proofErr w:type="spellStart"/>
+      <w:r>
+        <w:rPr>
+          <w:sz w:val="28"/>
+          <w:szCs w:val="28"/>
+        </w:rPr>
+        <w:t>мемристоров</w:t>
+      </w:r>
+      <w:proofErr w:type="spellEnd"/>
+      <w:r>
+        <w:rPr>
+          <w:sz w:val="28"/>
+          <w:szCs w:val="28"/>
+        </w:rPr>
+        <w:t xml:space="preserve">) и хранит эталоны даже без </w:t>
+      </w:r>
+      <w:r>
+        <w:rPr>
+          <w:sz w:val="28"/>
+          <w:szCs w:val="28"/>
+        </w:rPr>
+        <w:t>питания.</w:t>
+      </w:r>
+    </w:p>
+    <w:p>
+      <w:pPr>
+        <w:pStyle w:val="ds-markdown-paragraph"/>
+        <w:spacing w:before="0" w:beforeAutospacing="0" w:after="0" w:afterAutospacing="0"/>
+        <w:ind w:firstLine="709"/>
+        <w:jc w:val="both"/>
+        <w:rPr>
+          <w:sz w:val="28"/>
+          <w:szCs w:val="28"/>
+          <w:lang w:val="en-US"/>
+        </w:rPr>
+      </w:pPr>
+      <w:r>
+        <w:rPr>
+          <w:rStyle w:val="a6"/>
+          <w:sz w:val="28"/>
+          <w:szCs w:val="28"/>
+        </w:rPr>
+        <w:t>Вывод по реализации в EWB:</w:t>
+      </w:r>
+      <w:r>
+        <w:rPr>
+          <w:sz w:val="28"/>
+          <w:szCs w:val="28"/>
+        </w:rPr>
+        <w:br/>
+        <w:t xml:space="preserve">Сеть Хэмминга, собранная из стандартных компонентов (ОУ, резисторы) или с использованием модели </w:t>
+      </w:r>
+      <w:proofErr w:type="spellStart"/>
+      <w:r>
+        <w:rPr>
+          <w:sz w:val="28"/>
+          <w:szCs w:val="28"/>
+        </w:rPr>
+        <w:t>мемристора</w:t>
+      </w:r>
+      <w:proofErr w:type="spellEnd"/>
+      <w:r>
+        <w:rPr>
+          <w:sz w:val="28"/>
+          <w:szCs w:val="28"/>
+        </w:rPr>
+        <w:t xml:space="preserve">, стабильно выполняет функцию распознавания. Главное преимущество такой схемы перед программным кодом на </w:t>
+      </w:r>
+      <w:proofErr w:type="spellStart"/>
+      <w:r>
+        <w:rPr>
+          <w:sz w:val="28"/>
+          <w:szCs w:val="28"/>
+        </w:rPr>
+        <w:t>Python</w:t>
+      </w:r>
+      <w:proofErr w:type="spellEnd"/>
+      <w:r>
+        <w:rPr>
+          <w:sz w:val="28"/>
+          <w:szCs w:val="28"/>
+        </w:rPr>
+        <w:t xml:space="preserve"> — </w:t>
+      </w:r>
+      <w:r>
+        <w:rPr>
+          <w:rStyle w:val="a6"/>
+          <w:sz w:val="28"/>
+          <w:szCs w:val="28"/>
+        </w:rPr>
+        <w:t>мгновенный параллелизм</w:t>
+      </w:r>
+      <w:r>
+        <w:rPr>
+          <w:sz w:val="28"/>
+          <w:szCs w:val="28"/>
+        </w:rPr>
+        <w:t> (все вычисления происходят одновременно в реальном времени). Недостаток — при увеличении размера изображения (например, 100x100) схема становится громоздкой, но решается через технологию "</w:t>
+      </w:r>
+      <w:proofErr w:type="spellStart"/>
+      <w:r>
+        <w:rPr>
+          <w:sz w:val="28"/>
+          <w:szCs w:val="28"/>
+        </w:rPr>
+        <w:t>Crossbar</w:t>
+      </w:r>
+      <w:proofErr w:type="spellEnd"/>
+      <w:r>
+        <w:rPr>
+          <w:sz w:val="28"/>
+          <w:szCs w:val="28"/>
+        </w:rPr>
+        <w:t xml:space="preserve">" на </w:t>
+      </w:r>
+      <w:proofErr w:type="spellStart"/>
+      <w:r>
+        <w:rPr>
+          <w:sz w:val="28"/>
+          <w:szCs w:val="28"/>
+        </w:rPr>
+        <w:t>мемристорах</w:t>
+      </w:r>
+      <w:proofErr w:type="spellEnd"/>
+      <w:r>
+        <w:rPr>
+          <w:sz w:val="28"/>
+          <w:szCs w:val="28"/>
+          <w:lang w:val="en-US"/>
+        </w:rPr>
+        <w:t>.</w:t>
+      </w:r>
+      <w:bookmarkStart w:id="0" w:name="_GoBack"/>
+      <w:bookmarkEnd w:id="0"/>
+    </w:p>
+    <w:p>
+      <w:pPr>
+        <w:overflowPunct w:val="0"/>
+        <w:autoSpaceDE w:val="0"/>
+        <w:autoSpaceDN w:val="0"/>
+        <w:adjustRightInd w:val="0"/>
+        <w:spacing w:after="0" w:line="240" w:lineRule="auto"/>
+        <w:jc w:val="both"/>
+        <w:textAlignment w:val="baseline"/>
+        <w:rPr>
+          <w:rFonts w:ascii="Times New Roman" w:eastAsia="Times New Roman" w:hAnsi="Times New Roman" w:cs="Times New Roman"/>
+          <w:sz w:val="28"/>
+          <w:szCs w:val="28"/>
+          <w:lang w:val="en-US" w:eastAsia="ru-RU"/>
+        </w:rPr>
+      </w:pPr>
+    </w:p>
+    <w:p>
+      <w:pPr>
+        <w:overflowPunct w:val="0"/>
+        <w:autoSpaceDE w:val="0"/>
+        <w:autoSpaceDN w:val="0"/>
+        <w:adjustRightInd w:val="0"/>
+        <w:spacing w:after="0" w:line="240" w:lineRule="auto"/>
+        <w:jc w:val="both"/>
+        <w:textAlignment w:val="baseline"/>
+        <w:rPr>
+          <w:rFonts w:ascii="Times New Roman" w:eastAsia="Times New Roman" w:hAnsi="Times New Roman" w:cs="Times New Roman"/>
+          <w:sz w:val="28"/>
+          <w:szCs w:val="28"/>
+          <w:lang w:val="en-US" w:eastAsia="ru-RU"/>
+        </w:rPr>
+      </w:pPr>
+      <w:r>
+        <w:rPr>
+          <w:noProof/>
+          <w:lang w:eastAsia="ru-RU"/>
+        </w:rPr>
+        <w:lastRenderedPageBreak/>
+        <w:drawing>
+          <wp:inline distT="0" distB="0" distL="0" distR="0" wp14:anchorId="0A59A4F4" wp14:editId="38E6897F">
+            <wp:extent cx="5940425" cy="3510915"/>
+            <wp:effectExtent l="0" t="0" r="3175" b="0"/>
+            <wp:docPr id="3" name="Рисунок 3"/>
+            <wp:cNvGraphicFramePr>
+              <a:graphicFrameLocks xmlns:a="http://schemas.openxmlformats.org/drawingml/2006/main" noChangeAspect="1"/>
+            </wp:cNvGraphicFramePr>
+            <a:graphic xmlns:a="http://schemas.openxmlformats.org/drawingml/2006/main">
+              <a:graphicData uri="http://schemas.openxmlformats.org/drawingml/2006/picture">
+                <pic:pic xmlns:pic="http://schemas.openxmlformats.org/drawingml/2006/picture">
+                  <pic:nvPicPr>
+                    <pic:cNvPr id="1" name=""/>
+                    <pic:cNvPicPr/>
+                  </pic:nvPicPr>
+                  <pic:blipFill>
+                    <a:blip r:embed="rId8"/>
+                    <a:stretch>
+                      <a:fillRect/>
+                    </a:stretch>
+                  </pic:blipFill>
+                  <pic:spPr>
+                    <a:xfrm>
+                      <a:off x="0" y="0"/>
+                      <a:ext cx="5940425" cy="3510915"/>
+                    </a:xfrm>
+                    <a:prstGeom prst="rect">
+                      <a:avLst/>
+                    </a:prstGeom>
+                  </pic:spPr>
+                </pic:pic>
+              </a:graphicData>
+            </a:graphic>
+          </wp:inline>
+        </w:drawing>
+      </w:r>
+    </w:p>
+    <w:p>
+      <w:pPr>
+        <w:overflowPunct w:val="0"/>
+        <w:autoSpaceDE w:val="0"/>
+        <w:autoSpaceDN w:val="0"/>
+        <w:adjustRightInd w:val="0"/>
+        <w:spacing w:after="0" w:line="240" w:lineRule="auto"/>
+        <w:jc w:val="both"/>
+        <w:textAlignment w:val="baseline"/>
+        <w:rPr>
+          <w:rFonts w:ascii="Times New Roman" w:eastAsia="Times New Roman" w:hAnsi="Times New Roman" w:cs="Times New Roman"/>
+          <w:sz w:val="28"/>
+          <w:szCs w:val="28"/>
+          <w:lang w:val="en-US" w:eastAsia="ru-RU"/>
+        </w:rPr>
+      </w:pPr>
+      <w:r>
+        <w:rPr>
+          <w:noProof/>
+          <w:lang w:eastAsia="ru-RU"/>
+        </w:rPr>
+        <w:drawing>
+          <wp:inline distT="0" distB="0" distL="0" distR="0" wp14:anchorId="3135ADAB" wp14:editId="0CDEDE0F">
+            <wp:extent cx="5940425" cy="921385"/>
+            <wp:effectExtent l="0" t="0" r="3175" b="0"/>
+            <wp:docPr id="4" name="Рисунок 4"/>
+            <wp:cNvGraphicFramePr>
+              <a:graphicFrameLocks xmlns:a="http://schemas.openxmlformats.org/drawingml/2006/main" noChangeAspect="1"/>
+            </wp:cNvGraphicFramePr>
+            <a:graphic xmlns:a="http://schemas.openxmlformats.org/drawingml/2006/main">
+              <a:graphicData uri="http://schemas.openxmlformats.org/drawingml/2006/picture">
+                <pic:pic xmlns:pic="http://schemas.openxmlformats.org/drawingml/2006/picture">
+                  <pic:nvPicPr>
+                    <pic:cNvPr id="1" name=""/>
+                    <pic:cNvPicPr/>
+                  </pic:nvPicPr>
+                  <pic:blipFill>
+                    <a:blip r:embed="rId9"/>
+                    <a:stretch>
+                      <a:fillRect/>
+                    </a:stretch>
+                  </pic:blipFill>
+                  <pic:spPr>
+                    <a:xfrm>
+                      <a:off x="0" y="0"/>
+                      <a:ext cx="5940425" cy="921385"/>
+                    </a:xfrm>
+                    <a:prstGeom prst="rect">
+                      <a:avLst/>
+                    </a:prstGeom>
+                  </pic:spPr>
+                </pic:pic>
+              </a:graphicData>
+            </a:graphic>
+          </wp:inline>
+        </w:drawing>
+      </w:r>
+    </w:p>
+    <w:p>
+      <w:pPr>
+        <w:overflowPunct w:val="0"/>
+        <w:autoSpaceDE w:val="0"/>
+        <w:autoSpaceDN w:val="0"/>
+        <w:adjustRightInd w:val="0"/>
+        <w:spacing w:after="0" w:line="240" w:lineRule="auto"/>
+        <w:jc w:val="both"/>
+        <w:textAlignment w:val="baseline"/>
+        <w:rPr>
+          <w:rFonts w:ascii="Times New Roman" w:eastAsia="Times New Roman" w:hAnsi="Times New Roman" w:cs="Times New Roman"/>
+          <w:sz w:val="28"/>
+          <w:szCs w:val="28"/>
+          <w:lang w:val="en-US" w:eastAsia="ru-RU"/>
+        </w:rPr>
+      </w:pPr>
+      <w:r>
+        <w:rPr>
+          <w:noProof/>
+          <w:lang w:eastAsia="ru-RU"/>
+        </w:rPr>
+        <w:lastRenderedPageBreak/>
+        <w:drawing>
+          <wp:inline distT="0" distB="0" distL="0" distR="0" wp14:anchorId="6F6060F6" wp14:editId="4C86B8A4">
+            <wp:extent cx="5940425" cy="5128895"/>
+            <wp:effectExtent l="0" t="0" r="3175" b="0"/>
+            <wp:docPr id="5" name="Рисунок 5"/>
+            <wp:cNvGraphicFramePr>
+              <a:graphicFrameLocks xmlns:a="http://schemas.openxmlformats.org/drawingml/2006/main" noChangeAspect="1"/>
+            </wp:cNvGraphicFramePr>
+            <a:graphic xmlns:a="http://schemas.openxmlformats.org/drawingml/2006/main">
+              <a:graphicData uri="http://schemas.openxmlformats.org/drawingml/2006/picture">
+                <pic:pic xmlns:pic="http://schemas.openxmlformats.org/drawingml/2006/picture">
+                  <pic:nvPicPr>
+                    <pic:cNvPr id="1" name=""/>
+                    <pic:cNvPicPr/>
+                  </pic:nvPicPr>
+                  <pic:blipFill>
+                    <a:blip r:embed="rId10"/>
+                    <a:stretch>
+                      <a:fillRect/>
+                    </a:stretch>
+                  </pic:blipFill>
+                  <pic:spPr>
+                    <a:xfrm>
+                      <a:off x="0" y="0"/>
+                      <a:ext cx="5940425" cy="5128895"/>
+                    </a:xfrm>
+                    <a:prstGeom prst="rect">
+                      <a:avLst/>
+                    </a:prstGeom>
+                  </pic:spPr>
+                </pic:pic>
+              </a:graphicData>
+            </a:graphic>
+          </wp:inline>
+        </w:drawing>
+      </w:r>
+    </w:p>
+    <w:p>
+      <w:pPr>
+        <w:spacing w:after="0" w:line="240" w:lineRule="auto"/>
+        <w:ind w:firstLine="709"/>
+        <w:jc w:val="center"/>
+        <w:outlineLvl w:val="2"/>
+        <w:rPr>
+          <w:rFonts w:ascii="Times New Roman" w:eastAsia="Times New Roman" w:hAnsi="Times New Roman" w:cs="Times New Roman"/>
+          <w:b/>
+          <w:bCs/>
+          <w:sz w:val="28"/>
+          <w:szCs w:val="28"/>
+          <w:lang w:eastAsia="ru-RU"/>
+        </w:rPr>
+      </w:pPr>
+      <w:r>
+        <w:rPr>
+          <w:rFonts w:ascii="Times New Roman" w:eastAsia="Times New Roman" w:hAnsi="Times New Roman" w:cs="Times New Roman"/>
+          <w:b/>
+          <w:bCs/>
+          <w:sz w:val="28"/>
+          <w:szCs w:val="28"/>
+          <w:lang w:eastAsia="ru-RU"/>
+        </w:rPr>
+        <w:t>Особенности нейронной сети Хэмминга</w:t>
+      </w:r>
+    </w:p>
+    <w:p>
+      <w:pPr>
+        <w:spacing w:after="0" w:line="240" w:lineRule="auto"/>
+        <w:ind w:firstLine="709"/>
+        <w:jc w:val="both"/>
+        <w:rPr>
+          <w:rFonts w:ascii="Times New Roman" w:eastAsia="Times New Roman" w:hAnsi="Times New Roman" w:cs="Times New Roman"/>
+          <w:sz w:val="28"/>
+          <w:szCs w:val="28"/>
+          <w:lang w:eastAsia="ru-RU"/>
+        </w:rPr>
+      </w:pPr>
+      <w:r>
+        <w:rPr>
+          <w:rFonts w:ascii="Times New Roman" w:eastAsia="Times New Roman" w:hAnsi="Times New Roman" w:cs="Times New Roman"/>
+          <w:sz w:val="28"/>
+          <w:szCs w:val="28"/>
+          <w:lang w:eastAsia="ru-RU"/>
+        </w:rPr>
+        <w:t>Сеть Хэмминга — это специализированная нейронная сеть, предназначенная для классификации бинарных или биполярных векторов. Ее ключевая особенность заключается в использовании расстояния Хэмминга в качестве меры близости между входным и эталонными образами.</w:t>
+      </w:r>
+    </w:p>
+    <w:p>
+      <w:pPr>
+        <w:spacing w:after="0" w:line="240" w:lineRule="auto"/>
+        <w:ind w:firstLine="709"/>
+        <w:jc w:val="both"/>
+        <w:rPr>
+          <w:rFonts w:ascii="Times New Roman" w:eastAsia="Times New Roman" w:hAnsi="Times New Roman" w:cs="Times New Roman"/>
+          <w:sz w:val="28"/>
+          <w:szCs w:val="28"/>
+          <w:lang w:eastAsia="ru-RU"/>
+        </w:rPr>
+      </w:pPr>
+      <w:r>
+        <w:rPr>
+          <w:rFonts w:ascii="Times New Roman" w:eastAsia="Times New Roman" w:hAnsi="Times New Roman" w:cs="Times New Roman"/>
+          <w:b/>
+          <w:bCs/>
+          <w:sz w:val="28"/>
+          <w:szCs w:val="28"/>
+          <w:lang w:eastAsia="ru-RU"/>
+        </w:rPr>
+        <w:t>Основные особенности:</w:t>
+      </w:r>
+    </w:p>
+    <w:p>
+      <w:pPr>
+        <w:numPr>
+          <w:ilvl w:val="0"/>
+          <w:numId w:val="36"/>
+        </w:numPr>
+        <w:spacing w:after="0" w:line="240" w:lineRule="auto"/>
+        <w:ind w:left="0" w:firstLine="709"/>
+        <w:jc w:val="both"/>
+        <w:rPr>
+          <w:rFonts w:ascii="Times New Roman" w:eastAsia="Times New Roman" w:hAnsi="Times New Roman" w:cs="Times New Roman"/>
+          <w:sz w:val="28"/>
+          <w:szCs w:val="28"/>
+          <w:lang w:eastAsia="ru-RU"/>
+        </w:rPr>
+      </w:pPr>
+      <w:r>
+        <w:rPr>
+          <w:rFonts w:ascii="Times New Roman" w:eastAsia="Times New Roman" w:hAnsi="Times New Roman" w:cs="Times New Roman"/>
+          <w:b/>
+          <w:bCs/>
+          <w:sz w:val="28"/>
+          <w:szCs w:val="28"/>
+          <w:lang w:eastAsia="ru-RU"/>
+        </w:rPr>
+        <w:t>Назначение:</w:t>
+      </w:r>
+      <w:r>
+        <w:rPr>
+          <w:rFonts w:ascii="Times New Roman" w:eastAsia="Times New Roman" w:hAnsi="Times New Roman" w:cs="Times New Roman"/>
+          <w:sz w:val="28"/>
+          <w:szCs w:val="28"/>
+          <w:lang w:eastAsia="ru-RU"/>
+        </w:rPr>
+        <w:t> Эффективно решает задачу распознавания образов, сводя ее к определению минимального расстояния Хэмминга между искаженным входным вектором и набором чистых эталонов.</w:t>
+      </w:r>
+    </w:p>
+    <w:p>
+      <w:pPr>
+        <w:numPr>
+          <w:ilvl w:val="0"/>
+          <w:numId w:val="36"/>
+        </w:numPr>
+        <w:spacing w:after="0" w:line="240" w:lineRule="auto"/>
+        <w:ind w:left="0" w:firstLine="709"/>
+        <w:jc w:val="both"/>
+        <w:rPr>
+          <w:rFonts w:ascii="Times New Roman" w:eastAsia="Times New Roman" w:hAnsi="Times New Roman" w:cs="Times New Roman"/>
+          <w:sz w:val="28"/>
+          <w:szCs w:val="28"/>
+          <w:lang w:eastAsia="ru-RU"/>
+        </w:rPr>
+      </w:pPr>
+      <w:r>
+        <w:rPr>
+          <w:rFonts w:ascii="Times New Roman" w:eastAsia="Times New Roman" w:hAnsi="Times New Roman" w:cs="Times New Roman"/>
+          <w:b/>
+          <w:bCs/>
+          <w:sz w:val="28"/>
+          <w:szCs w:val="28"/>
+          <w:lang w:eastAsia="ru-RU"/>
+        </w:rPr>
+        <w:t>Скорость обучения:</w:t>
+      </w:r>
+      <w:r>
+        <w:rPr>
+          <w:rFonts w:ascii="Times New Roman" w:eastAsia="Times New Roman" w:hAnsi="Times New Roman" w:cs="Times New Roman"/>
+          <w:sz w:val="28"/>
+          <w:szCs w:val="28"/>
+          <w:lang w:eastAsia="ru-RU"/>
+        </w:rPr>
+        <w:t> Обучение происходит за одну эпоху (однократное предъявление эталонов), что делает сеть очень быстрой в настройке по сравнению с многослойными персептронами.</w:t>
+      </w:r>
+    </w:p>
+    <w:p>
+      <w:pPr>
+        <w:numPr>
+          <w:ilvl w:val="0"/>
+          <w:numId w:val="36"/>
+        </w:numPr>
+        <w:spacing w:after="0" w:line="240" w:lineRule="auto"/>
+        <w:ind w:left="0" w:firstLine="709"/>
+        <w:jc w:val="both"/>
+        <w:rPr>
+          <w:rFonts w:ascii="Times New Roman" w:eastAsia="Times New Roman" w:hAnsi="Times New Roman" w:cs="Times New Roman"/>
+          <w:sz w:val="28"/>
+          <w:szCs w:val="28"/>
+          <w:lang w:eastAsia="ru-RU"/>
+        </w:rPr>
+      </w:pPr>
+      <w:r>
+        <w:rPr>
+          <w:rFonts w:ascii="Times New Roman" w:eastAsia="Times New Roman" w:hAnsi="Times New Roman" w:cs="Times New Roman"/>
+          <w:b/>
+          <w:bCs/>
+          <w:sz w:val="28"/>
+          <w:szCs w:val="28"/>
+          <w:lang w:eastAsia="ru-RU"/>
+        </w:rPr>
+        <w:t>Архитектура:</w:t>
+      </w:r>
+      <w:r>
+        <w:rPr>
+          <w:rFonts w:ascii="Times New Roman" w:eastAsia="Times New Roman" w:hAnsi="Times New Roman" w:cs="Times New Roman"/>
+          <w:sz w:val="28"/>
+          <w:szCs w:val="28"/>
+          <w:lang w:eastAsia="ru-RU"/>
+        </w:rPr>
+        <w:t xml:space="preserve"> Является трехслойной сетью с обратными связями (обычно первый слой — входной, второй — слой Хэмминга/взвешенной суммы, третий — слой </w:t>
+      </w:r>
+      <w:r>
+        <w:rPr>
+          <w:rFonts w:ascii="Times New Roman" w:eastAsia="Times New Roman" w:hAnsi="Times New Roman" w:cs="Times New Roman"/>
+          <w:b/>
+          <w:sz w:val="28"/>
+          <w:szCs w:val="28"/>
+          <w:lang w:eastAsia="ru-RU"/>
+        </w:rPr>
+        <w:t>MAXNET</w:t>
+      </w:r>
+      <w:r>
+        <w:rPr>
+          <w:rFonts w:ascii="Times New Roman" w:eastAsia="Times New Roman" w:hAnsi="Times New Roman" w:cs="Times New Roman"/>
+          <w:sz w:val="28"/>
+          <w:szCs w:val="28"/>
+          <w:lang w:eastAsia="ru-RU"/>
+        </w:rPr>
+        <w:t>, отвечающий за выделение победителя).</w:t>
+      </w:r>
+    </w:p>
+    <w:p>
+      <w:pPr>
+        <w:numPr>
+          <w:ilvl w:val="0"/>
+          <w:numId w:val="36"/>
+        </w:numPr>
+        <w:spacing w:after="0" w:line="240" w:lineRule="auto"/>
+        <w:ind w:left="0" w:firstLine="709"/>
+        <w:jc w:val="both"/>
+        <w:rPr>
+          <w:rFonts w:ascii="Times New Roman" w:eastAsia="Times New Roman" w:hAnsi="Times New Roman" w:cs="Times New Roman"/>
+          <w:sz w:val="28"/>
+          <w:szCs w:val="28"/>
+          <w:lang w:eastAsia="ru-RU"/>
+        </w:rPr>
+      </w:pPr>
+      <w:r>
+        <w:rPr>
+          <w:rFonts w:ascii="Times New Roman" w:eastAsia="Times New Roman" w:hAnsi="Times New Roman" w:cs="Times New Roman"/>
+          <w:b/>
+          <w:bCs/>
+          <w:sz w:val="28"/>
+          <w:szCs w:val="28"/>
+          <w:lang w:eastAsia="ru-RU"/>
+        </w:rPr>
+        <w:t>Классификация:</w:t>
+      </w:r>
+      <w:r>
+        <w:rPr>
+          <w:rFonts w:ascii="Times New Roman" w:eastAsia="Times New Roman" w:hAnsi="Times New Roman" w:cs="Times New Roman"/>
+          <w:sz w:val="28"/>
+          <w:szCs w:val="28"/>
+          <w:lang w:eastAsia="ru-RU"/>
+        </w:rPr>
+        <w:t> Сеть гарантированно находит эталон, наиболее близкий к входному вектору, даже если входной сигнал сильно зашумлен или поврежден.</w:t>
+      </w:r>
+    </w:p>
+    <w:p>
+      <w:pPr>
+        <w:numPr>
+          <w:ilvl w:val="0"/>
+          <w:numId w:val="36"/>
+        </w:numPr>
+        <w:spacing w:after="0" w:line="240" w:lineRule="auto"/>
+        <w:ind w:left="0" w:firstLine="709"/>
+        <w:jc w:val="both"/>
+        <w:rPr>
+          <w:rFonts w:ascii="Times New Roman" w:eastAsia="Times New Roman" w:hAnsi="Times New Roman" w:cs="Times New Roman"/>
+          <w:sz w:val="28"/>
+          <w:szCs w:val="28"/>
+          <w:lang w:eastAsia="ru-RU"/>
+        </w:rPr>
+      </w:pPr>
+      <w:r>
+        <w:rPr>
+          <w:rFonts w:ascii="Times New Roman" w:eastAsia="Times New Roman" w:hAnsi="Times New Roman" w:cs="Times New Roman"/>
+          <w:b/>
+          <w:bCs/>
+          <w:sz w:val="28"/>
+          <w:szCs w:val="28"/>
+          <w:lang w:eastAsia="ru-RU"/>
+        </w:rPr>
+        <w:lastRenderedPageBreak/>
+        <w:t>Ограничение:</w:t>
+      </w:r>
+      <w:r>
+        <w:rPr>
+          <w:rFonts w:ascii="Times New Roman" w:eastAsia="Times New Roman" w:hAnsi="Times New Roman" w:cs="Times New Roman"/>
+          <w:sz w:val="28"/>
+          <w:szCs w:val="28"/>
+          <w:lang w:eastAsia="ru-RU"/>
+        </w:rPr>
+        <w:t> Сеть не может определить, что входной вектор одинаково близок к двум разным эталонам. В такой ситуации работа MAXNET блокируется, выдача результата прекращается (выходы обнуляются).</w:t>
+      </w:r>
+    </w:p>
+    <w:p>
+      <w:pPr>
+        <w:numPr>
+          <w:ilvl w:val="0"/>
+          <w:numId w:val="36"/>
+        </w:numPr>
+        <w:spacing w:after="0" w:line="240" w:lineRule="auto"/>
+        <w:ind w:left="0" w:firstLine="709"/>
+        <w:jc w:val="both"/>
+        <w:rPr>
+          <w:rFonts w:ascii="Times New Roman" w:eastAsia="Times New Roman" w:hAnsi="Times New Roman" w:cs="Times New Roman"/>
+          <w:sz w:val="28"/>
+          <w:szCs w:val="28"/>
+          <w:lang w:eastAsia="ru-RU"/>
+        </w:rPr>
+      </w:pPr>
+      <w:proofErr w:type="spellStart"/>
+      <w:r>
+        <w:rPr>
+          <w:rFonts w:ascii="Times New Roman" w:eastAsia="Times New Roman" w:hAnsi="Times New Roman" w:cs="Times New Roman"/>
+          <w:b/>
+          <w:bCs/>
+          <w:sz w:val="28"/>
+          <w:szCs w:val="28"/>
+          <w:lang w:eastAsia="ru-RU"/>
+        </w:rPr>
+        <w:t>Бинарность</w:t>
+      </w:r>
+      <w:proofErr w:type="spellEnd"/>
+      <w:r>
+        <w:rPr>
+          <w:rFonts w:ascii="Times New Roman" w:eastAsia="Times New Roman" w:hAnsi="Times New Roman" w:cs="Times New Roman"/>
+          <w:b/>
+          <w:bCs/>
+          <w:sz w:val="28"/>
+          <w:szCs w:val="28"/>
+          <w:lang w:eastAsia="ru-RU"/>
+        </w:rPr>
+        <w:t>:</w:t>
+      </w:r>
+      <w:r>
+        <w:rPr>
+          <w:rFonts w:ascii="Times New Roman" w:eastAsia="Times New Roman" w:hAnsi="Times New Roman" w:cs="Times New Roman"/>
+          <w:sz w:val="28"/>
+          <w:szCs w:val="28"/>
+          <w:lang w:eastAsia="ru-RU"/>
+        </w:rPr>
+        <w:t> Традиционно работает с бинарными данными (0/1) или биполярными (-1/+1), что оптимально для распознавания черно-белых изображений.</w:t>
+      </w:r>
+    </w:p>
+    <w:p>
+      <w:pPr>
+        <w:spacing w:after="0" w:line="240" w:lineRule="auto"/>
+        <w:ind w:firstLine="709"/>
+        <w:jc w:val="center"/>
+        <w:outlineLvl w:val="2"/>
+        <w:rPr>
+          <w:rFonts w:ascii="Times New Roman" w:eastAsia="Times New Roman" w:hAnsi="Times New Roman" w:cs="Times New Roman"/>
+          <w:b/>
+          <w:bCs/>
+          <w:sz w:val="28"/>
+          <w:szCs w:val="28"/>
+          <w:lang w:eastAsia="ru-RU"/>
+        </w:rPr>
+      </w:pPr>
+      <w:r>
+        <w:rPr>
+          <w:rFonts w:ascii="Times New Roman" w:eastAsia="Times New Roman" w:hAnsi="Times New Roman" w:cs="Times New Roman"/>
+          <w:b/>
+          <w:bCs/>
+          <w:sz w:val="28"/>
+          <w:szCs w:val="28"/>
+          <w:lang w:eastAsia="ru-RU"/>
+        </w:rPr>
+        <w:t>Математическая модель нейронной сети Хэмминга</w:t>
+      </w:r>
+    </w:p>
+    <w:p>
+      <w:pPr>
+        <w:spacing w:after="0" w:line="240" w:lineRule="auto"/>
+        <w:ind w:firstLine="709"/>
+        <w:jc w:val="both"/>
+        <w:rPr>
+          <w:rFonts w:ascii="Times New Roman" w:eastAsia="Times New Roman" w:hAnsi="Times New Roman" w:cs="Times New Roman"/>
+          <w:sz w:val="28"/>
+          <w:szCs w:val="28"/>
+          <w:lang w:eastAsia="ru-RU"/>
+        </w:rPr>
+      </w:pPr>
+      <w:r>
+        <w:rPr>
+          <w:rFonts w:ascii="Times New Roman" w:eastAsia="Times New Roman" w:hAnsi="Times New Roman" w:cs="Times New Roman"/>
+          <w:sz w:val="28"/>
+          <w:szCs w:val="28"/>
+          <w:lang w:eastAsia="ru-RU"/>
+        </w:rPr>
+        <w:t>Математическая модель описывает прохождение сигнала от входа до выхода.</w:t>
+      </w:r>
+    </w:p>
+    <w:p>
+      <w:pPr>
+        <w:spacing w:after="0" w:line="240" w:lineRule="auto"/>
+        <w:ind w:firstLine="709"/>
+        <w:rPr>
+          <w:rFonts w:ascii="Times New Roman" w:eastAsia="Times New Roman" w:hAnsi="Times New Roman" w:cs="Times New Roman"/>
+          <w:sz w:val="28"/>
+          <w:szCs w:val="28"/>
+          <w:lang w:eastAsia="ru-RU"/>
+        </w:rPr>
+      </w:pPr>
+      <w:r>
+        <w:rPr>
+          <w:rFonts w:ascii="Times New Roman" w:eastAsia="Times New Roman" w:hAnsi="Times New Roman" w:cs="Times New Roman"/>
+          <w:b/>
+          <w:bCs/>
+          <w:sz w:val="28"/>
+          <w:szCs w:val="28"/>
+          <w:lang w:eastAsia="ru-RU"/>
+        </w:rPr>
+        <w:t>Входные данные:</w:t>
+      </w:r>
+      <w:r>
+        <w:rPr>
+          <w:rFonts w:ascii="Times New Roman" w:eastAsia="Times New Roman" w:hAnsi="Times New Roman" w:cs="Times New Roman"/>
+          <w:sz w:val="28"/>
+          <w:szCs w:val="28"/>
+          <w:lang w:eastAsia="ru-RU"/>
+        </w:rPr>
+        <w:br/>
+        <w:t>Входной вектор </w:t>
+      </w:r>
+      <w:r>
+        <w:rPr>
+          <w:rFonts w:ascii="Times New Roman" w:eastAsia="Times New Roman" w:hAnsi="Times New Roman" w:cs="Times New Roman"/>
+          <w:sz w:val="28"/>
+          <w:szCs w:val="28"/>
+          <w:bdr w:val="none" w:sz="0" w:space="0" w:color="auto" w:frame="1"/>
+          <w:lang w:eastAsia="ru-RU"/>
+        </w:rPr>
+        <w:t>X=(x1,x2,...,</w:t>
+      </w:r>
+      <w:proofErr w:type="spellStart"/>
+      <w:r>
+        <w:rPr>
+          <w:rFonts w:ascii="Times New Roman" w:eastAsia="Times New Roman" w:hAnsi="Times New Roman" w:cs="Times New Roman"/>
+          <w:sz w:val="28"/>
+          <w:szCs w:val="28"/>
+          <w:bdr w:val="none" w:sz="0" w:space="0" w:color="auto" w:frame="1"/>
+          <w:lang w:eastAsia="ru-RU"/>
+        </w:rPr>
+        <w:t>xn</w:t>
+      </w:r>
+      <w:proofErr w:type="spellEnd"/>
+      <w:r>
+        <w:rPr>
+          <w:rFonts w:ascii="Times New Roman" w:eastAsia="Times New Roman" w:hAnsi="Times New Roman" w:cs="Times New Roman"/>
+          <w:sz w:val="28"/>
+          <w:szCs w:val="28"/>
+          <w:bdr w:val="none" w:sz="0" w:space="0" w:color="auto" w:frame="1"/>
+          <w:lang w:eastAsia="ru-RU"/>
+        </w:rPr>
+        <w:t>)</w:t>
+      </w:r>
+      <w:r>
+        <w:rPr>
+          <w:rFonts w:ascii="Times New Roman" w:eastAsia="Times New Roman" w:hAnsi="Times New Roman" w:cs="Times New Roman"/>
+          <w:sz w:val="28"/>
+          <w:szCs w:val="28"/>
+          <w:lang w:eastAsia="ru-RU"/>
+        </w:rPr>
+        <w:t>, где </w:t>
+      </w:r>
+      <w:proofErr w:type="spellStart"/>
+      <w:r>
+        <w:rPr>
+          <w:rFonts w:ascii="Times New Roman" w:eastAsia="Times New Roman" w:hAnsi="Times New Roman" w:cs="Times New Roman"/>
+          <w:sz w:val="28"/>
+          <w:szCs w:val="28"/>
+          <w:bdr w:val="none" w:sz="0" w:space="0" w:color="auto" w:frame="1"/>
+          <w:lang w:eastAsia="ru-RU"/>
+        </w:rPr>
+        <w:t>xi</w:t>
+      </w:r>
+      <w:proofErr w:type="spellEnd"/>
+      <w:r>
+        <w:rPr>
+          <w:rFonts w:ascii="Cambria Math" w:eastAsia="Times New Roman" w:hAnsi="Cambria Math" w:cs="Cambria Math"/>
+          <w:sz w:val="28"/>
+          <w:szCs w:val="28"/>
+          <w:bdr w:val="none" w:sz="0" w:space="0" w:color="auto" w:frame="1"/>
+          <w:lang w:eastAsia="ru-RU"/>
+        </w:rPr>
+        <w:t>∈</w:t>
+      </w:r>
+      <w:r>
+        <w:rPr>
+          <w:rFonts w:ascii="Times New Roman" w:eastAsia="Times New Roman" w:hAnsi="Times New Roman" w:cs="Times New Roman"/>
+          <w:sz w:val="28"/>
+          <w:szCs w:val="28"/>
+          <w:bdr w:val="none" w:sz="0" w:space="0" w:color="auto" w:frame="1"/>
+          <w:lang w:eastAsia="ru-RU"/>
+        </w:rPr>
+        <w:t>{0,1}</w:t>
+      </w:r>
+      <w:r>
+        <w:rPr>
+          <w:rFonts w:ascii="Times New Roman" w:eastAsia="Times New Roman" w:hAnsi="Times New Roman" w:cs="Times New Roman"/>
+          <w:sz w:val="28"/>
+          <w:szCs w:val="28"/>
+          <w:lang w:eastAsia="ru-RU"/>
+        </w:rPr>
+        <w:t xml:space="preserve"> или </w:t>
+      </w:r>
+      <w:r>
+        <w:rPr>
+          <w:rFonts w:ascii="Times New Roman" w:eastAsia="Times New Roman" w:hAnsi="Times New Roman" w:cs="Times New Roman"/>
+          <w:sz w:val="28"/>
+          <w:szCs w:val="28"/>
+          <w:bdr w:val="none" w:sz="0" w:space="0" w:color="auto" w:frame="1"/>
+          <w:lang w:eastAsia="ru-RU"/>
+        </w:rPr>
+        <w:t>{−1,+1}</w:t>
+      </w:r>
+      <w:r>
+        <w:rPr>
+          <w:rFonts w:ascii="Times New Roman" w:eastAsia="Times New Roman" w:hAnsi="Times New Roman" w:cs="Times New Roman"/>
+          <w:sz w:val="28"/>
+          <w:szCs w:val="28"/>
+          <w:lang w:eastAsia="ru-RU"/>
+        </w:rPr>
+        <w:t xml:space="preserve">. </w:t>
+      </w:r>
+    </w:p>
+    <w:p>
+      <w:pPr>
+        <w:spacing w:after="0" w:line="240" w:lineRule="auto"/>
+        <w:rPr>
+          <w:rFonts w:ascii="Times New Roman" w:eastAsia="Times New Roman" w:hAnsi="Times New Roman" w:cs="Times New Roman"/>
+          <w:sz w:val="28"/>
+          <w:szCs w:val="28"/>
+          <w:lang w:eastAsia="ru-RU"/>
+        </w:rPr>
+      </w:pPr>
+      <w:r>
+        <w:rPr>
+          <w:rFonts w:ascii="Times New Roman" w:eastAsia="Times New Roman" w:hAnsi="Times New Roman" w:cs="Times New Roman"/>
+          <w:sz w:val="28"/>
+          <w:szCs w:val="28"/>
+          <w:lang w:eastAsia="ru-RU"/>
+        </w:rPr>
+        <w:t>Количество эталонов — </w:t>
+      </w:r>
+      <w:r>
+        <w:rPr>
+          <w:rFonts w:ascii="Times New Roman" w:eastAsia="Times New Roman" w:hAnsi="Times New Roman" w:cs="Times New Roman"/>
+          <w:sz w:val="28"/>
+          <w:szCs w:val="28"/>
+          <w:bdr w:val="none" w:sz="0" w:space="0" w:color="auto" w:frame="1"/>
+          <w:lang w:eastAsia="ru-RU"/>
+        </w:rPr>
+        <w:t>m</w:t>
+      </w:r>
+      <w:r>
+        <w:rPr>
+          <w:rFonts w:ascii="Times New Roman" w:eastAsia="Times New Roman" w:hAnsi="Times New Roman" w:cs="Times New Roman"/>
+          <w:sz w:val="28"/>
+          <w:szCs w:val="28"/>
+          <w:lang w:eastAsia="ru-RU"/>
+        </w:rPr>
+        <w:t>.</w:t>
+      </w:r>
+    </w:p>
+    <w:p>
+      <w:pPr>
+        <w:spacing w:after="0" w:line="240" w:lineRule="auto"/>
+        <w:ind w:firstLine="709"/>
+        <w:rPr>
+          <w:rFonts w:ascii="Times New Roman" w:eastAsia="Times New Roman" w:hAnsi="Times New Roman" w:cs="Times New Roman"/>
+          <w:sz w:val="28"/>
+          <w:szCs w:val="28"/>
+          <w:lang w:eastAsia="ru-RU"/>
+        </w:rPr>
+      </w:pPr>
+      <w:r>
+        <w:rPr>
+          <w:rFonts w:ascii="Times New Roman" w:eastAsia="Times New Roman" w:hAnsi="Times New Roman" w:cs="Times New Roman"/>
+          <w:b/>
+          <w:bCs/>
+          <w:sz w:val="28"/>
+          <w:szCs w:val="28"/>
+          <w:lang w:eastAsia="ru-RU"/>
+        </w:rPr>
+        <w:t>1-й слой (Вычисление сходства):</w:t>
+      </w:r>
+      <w:r>
+        <w:rPr>
+          <w:rFonts w:ascii="Times New Roman" w:eastAsia="Times New Roman" w:hAnsi="Times New Roman" w:cs="Times New Roman"/>
+          <w:sz w:val="28"/>
+          <w:szCs w:val="28"/>
+          <w:lang w:eastAsia="ru-RU"/>
+        </w:rPr>
+        <w:br/>
+        <w:t>Каждый нейрон </w:t>
+      </w:r>
+      <w:r>
+        <w:rPr>
+          <w:rFonts w:ascii="Times New Roman" w:eastAsia="Times New Roman" w:hAnsi="Times New Roman" w:cs="Times New Roman"/>
+          <w:sz w:val="28"/>
+          <w:szCs w:val="28"/>
+          <w:bdr w:val="none" w:sz="0" w:space="0" w:color="auto" w:frame="1"/>
+          <w:lang w:eastAsia="ru-RU"/>
+        </w:rPr>
+        <w:t>j</w:t>
+      </w:r>
+      <w:r>
+        <w:rPr>
+          <w:rFonts w:ascii="Times New Roman" w:eastAsia="Times New Roman" w:hAnsi="Times New Roman" w:cs="Times New Roman"/>
+          <w:sz w:val="28"/>
+          <w:szCs w:val="28"/>
+          <w:lang w:eastAsia="ru-RU"/>
+        </w:rPr>
+        <w:t> в этом слое соответствует одному эталонному вектору </w:t>
+      </w:r>
+      <w:proofErr w:type="spellStart"/>
+      <w:r>
+        <w:rPr>
+          <w:rFonts w:ascii="Times New Roman" w:eastAsia="Times New Roman" w:hAnsi="Times New Roman" w:cs="Times New Roman"/>
+          <w:sz w:val="28"/>
+          <w:szCs w:val="28"/>
+          <w:bdr w:val="none" w:sz="0" w:space="0" w:color="auto" w:frame="1"/>
+          <w:lang w:eastAsia="ru-RU"/>
+        </w:rPr>
+        <w:t>Vj</w:t>
+      </w:r>
+      <w:proofErr w:type="spellEnd"/>
+      <w:r>
+        <w:rPr>
+          <w:rFonts w:ascii="Times New Roman" w:eastAsia="Times New Roman" w:hAnsi="Times New Roman" w:cs="Times New Roman"/>
+          <w:sz w:val="28"/>
+          <w:szCs w:val="28"/>
+          <w:lang w:eastAsia="ru-RU"/>
+        </w:rPr>
+        <w:t>. Входной сигнал нейрона </w:t>
+      </w:r>
+      <w:r>
+        <w:rPr>
+          <w:rFonts w:ascii="Times New Roman" w:eastAsia="Times New Roman" w:hAnsi="Times New Roman" w:cs="Times New Roman"/>
+          <w:sz w:val="28"/>
+          <w:szCs w:val="28"/>
+          <w:bdr w:val="none" w:sz="0" w:space="0" w:color="auto" w:frame="1"/>
+          <w:lang w:eastAsia="ru-RU"/>
+        </w:rPr>
+        <w:t>j</w:t>
+      </w:r>
+      <w:r>
+        <w:rPr>
+          <w:rFonts w:ascii="Times New Roman" w:eastAsia="Times New Roman" w:hAnsi="Times New Roman" w:cs="Times New Roman"/>
+          <w:sz w:val="28"/>
+          <w:szCs w:val="28"/>
+          <w:lang w:eastAsia="ru-RU"/>
+        </w:rPr>
+        <w:t> — это взвешенная сумма, которая пропорциональна скалярному произведению входного вектора на эталон. Для биполярных векторов (</w:t>
+      </w:r>
+      <w:r>
+        <w:rPr>
+          <w:rFonts w:ascii="Times New Roman" w:eastAsia="Times New Roman" w:hAnsi="Times New Roman" w:cs="Times New Roman"/>
+          <w:sz w:val="28"/>
+          <w:szCs w:val="28"/>
+          <w:bdr w:val="none" w:sz="0" w:space="0" w:color="auto" w:frame="1"/>
+          <w:lang w:eastAsia="ru-RU"/>
+        </w:rPr>
+        <w:t>−1</w:t>
+      </w:r>
+      <w:r>
+        <w:rPr>
+          <w:rFonts w:ascii="Times New Roman" w:eastAsia="Times New Roman" w:hAnsi="Times New Roman" w:cs="Times New Roman"/>
+          <w:sz w:val="28"/>
+          <w:szCs w:val="28"/>
+          <w:lang w:eastAsia="ru-RU"/>
+        </w:rPr>
+        <w:t>−1 и </w:t>
+      </w:r>
+      <w:r>
+        <w:rPr>
+          <w:rFonts w:ascii="Times New Roman" w:eastAsia="Times New Roman" w:hAnsi="Times New Roman" w:cs="Times New Roman"/>
+          <w:sz w:val="28"/>
+          <w:szCs w:val="28"/>
+          <w:bdr w:val="none" w:sz="0" w:space="0" w:color="auto" w:frame="1"/>
+          <w:lang w:eastAsia="ru-RU"/>
+        </w:rPr>
+        <w:t>+1</w:t>
+      </w:r>
+      <w:r>
+        <w:rPr>
+          <w:rFonts w:ascii="Times New Roman" w:eastAsia="Times New Roman" w:hAnsi="Times New Roman" w:cs="Times New Roman"/>
+          <w:sz w:val="28"/>
+          <w:szCs w:val="28"/>
+          <w:lang w:eastAsia="ru-RU"/>
+        </w:rPr>
+        <w:t>+1) формула преобразуется в меру сходства через расстояние Хэмминга </w:t>
+      </w:r>
+      <w:r>
+        <w:rPr>
+          <w:rFonts w:ascii="Times New Roman" w:eastAsia="Times New Roman" w:hAnsi="Times New Roman" w:cs="Times New Roman"/>
+          <w:sz w:val="28"/>
+          <w:szCs w:val="28"/>
+          <w:bdr w:val="none" w:sz="0" w:space="0" w:color="auto" w:frame="1"/>
+          <w:lang w:eastAsia="ru-RU"/>
+        </w:rPr>
+        <w:t>R</w:t>
+      </w:r>
+      <w:r>
+        <w:rPr>
+          <w:rFonts w:ascii="Times New Roman" w:eastAsia="Times New Roman" w:hAnsi="Times New Roman" w:cs="Times New Roman"/>
+          <w:sz w:val="28"/>
+          <w:szCs w:val="28"/>
+          <w:lang w:eastAsia="ru-RU"/>
+        </w:rPr>
+        <w:t>:</w:t>
+      </w:r>
+    </w:p>
+    <w:p>
+      <w:pPr>
+        <w:spacing w:after="0" w:line="240" w:lineRule="auto"/>
+        <w:ind w:firstLine="709"/>
+        <w:jc w:val="both"/>
+        <w:rPr>
+          <w:rFonts w:ascii="Times New Roman" w:eastAsia="Times New Roman" w:hAnsi="Times New Roman" w:cs="Times New Roman"/>
+          <w:sz w:val="28"/>
+          <w:szCs w:val="28"/>
+          <w:lang w:eastAsia="ru-RU"/>
+        </w:rPr>
+      </w:pPr>
+      <w:r>
+        <w:rPr>
+          <w:rFonts w:ascii="Times New Roman" w:hAnsi="Times New Roman" w:cs="Times New Roman"/>
+          <w:noProof/>
+          <w:sz w:val="28"/>
+          <w:szCs w:val="28"/>
+          <w:lang w:eastAsia="ru-RU"/>
+        </w:rPr>
+        <w:drawing>
+          <wp:inline distT="0" distB="0" distL="0" distR="0" wp14:anchorId="65FA4A20" wp14:editId="4DFA8A50">
+            <wp:extent cx="2886075" cy="781050"/>
+            <wp:effectExtent l="0" t="0" r="9525" b="0"/>
+            <wp:docPr id="8" name="Рисунок 8"/>
+            <wp:cNvGraphicFramePr>
+              <a:graphicFrameLocks xmlns:a="http://schemas.openxmlformats.org/drawingml/2006/main" noChangeAspect="1"/>
+            </wp:cNvGraphicFramePr>
+            <a:graphic xmlns:a="http://schemas.openxmlformats.org/drawingml/2006/main">
+              <a:graphicData uri="http://schemas.openxmlformats.org/drawingml/2006/picture">
+                <pic:pic xmlns:pic="http://schemas.openxmlformats.org/drawingml/2006/picture">
+                  <pic:nvPicPr>
+                    <pic:cNvPr id="1" name=""/>
+                    <pic:cNvPicPr/>
+                  </pic:nvPicPr>
+                  <pic:blipFill>
+                    <a:blip r:embed="rId11"/>
+                    <a:stretch>
+                      <a:fillRect/>
+                    </a:stretch>
+                  </pic:blipFill>
+                  <pic:spPr>
+                    <a:xfrm>
+                      <a:off x="0" y="0"/>
+                      <a:ext cx="2886075" cy="781050"/>
+                    </a:xfrm>
+                    <a:prstGeom prst="rect">
+                      <a:avLst/>
+                    </a:prstGeom>
+                  </pic:spPr>
+                </pic:pic>
+              </a:graphicData>
+            </a:graphic>
+          </wp:inline>
+        </w:drawing>
+      </w:r>
+    </w:p>
+    <w:p>
+      <w:pPr>
+        <w:spacing w:after="0" w:line="240" w:lineRule="auto"/>
+        <w:ind w:firstLine="709"/>
+        <w:jc w:val="both"/>
+        <w:rPr>
+          <w:rFonts w:ascii="Times New Roman" w:eastAsia="Times New Roman" w:hAnsi="Times New Roman" w:cs="Times New Roman"/>
+          <w:sz w:val="28"/>
+          <w:szCs w:val="28"/>
+          <w:lang w:eastAsia="ru-RU"/>
+        </w:rPr>
+      </w:pPr>
+      <w:r>
+        <w:rPr>
+          <w:rFonts w:ascii="Times New Roman" w:eastAsia="Times New Roman" w:hAnsi="Times New Roman" w:cs="Times New Roman"/>
+          <w:sz w:val="28"/>
+          <w:szCs w:val="28"/>
+          <w:lang w:eastAsia="ru-RU"/>
+        </w:rPr>
+        <w:t>Здесь </w:t>
+      </w:r>
+      <w:r>
+        <w:rPr>
+          <w:rFonts w:ascii="Times New Roman" w:eastAsia="Times New Roman" w:hAnsi="Times New Roman" w:cs="Times New Roman"/>
+          <w:sz w:val="28"/>
+          <w:szCs w:val="28"/>
+          <w:bdr w:val="none" w:sz="0" w:space="0" w:color="auto" w:frame="1"/>
+          <w:lang w:eastAsia="ru-RU"/>
+        </w:rPr>
+        <w:t>n</w:t>
+      </w:r>
+      <w:r>
+        <w:rPr>
+          <w:rFonts w:ascii="Times New Roman" w:eastAsia="Times New Roman" w:hAnsi="Times New Roman" w:cs="Times New Roman"/>
+          <w:sz w:val="28"/>
+          <w:szCs w:val="28"/>
+          <w:lang w:eastAsia="ru-RU"/>
+        </w:rPr>
+        <w:t xml:space="preserve"> — размерность вектора. Это выражение </w:t>
+      </w:r>
+      <w:r>
+        <w:rPr>
+          <w:rFonts w:ascii="Times New Roman" w:eastAsia="Times New Roman" w:hAnsi="Times New Roman" w:cs="Times New Roman"/>
+          <w:sz w:val="28"/>
+          <w:szCs w:val="28"/>
+          <w:lang w:eastAsia="ru-RU"/>
+        </w:rPr>
+        <w:t>максимизирует</w:t>
+      </w:r>
+      <w:r>
+        <w:rPr>
+          <w:rFonts w:ascii="Times New Roman" w:eastAsia="Times New Roman" w:hAnsi="Times New Roman" w:cs="Times New Roman"/>
+          <w:sz w:val="28"/>
+          <w:szCs w:val="28"/>
+          <w:lang w:eastAsia="ru-RU"/>
+        </w:rPr>
+        <w:t>, когда расстояние Хэмминга минимально.</w:t>
+      </w:r>
+    </w:p>
+    <w:p>
+      <w:pPr>
+        <w:spacing w:after="0" w:line="240" w:lineRule="auto"/>
+        <w:ind w:firstLine="709"/>
+        <w:jc w:val="both"/>
+        <w:rPr>
+          <w:rFonts w:ascii="Times New Roman" w:eastAsia="Times New Roman" w:hAnsi="Times New Roman" w:cs="Times New Roman"/>
+          <w:sz w:val="28"/>
+          <w:szCs w:val="28"/>
+          <w:lang w:eastAsia="ru-RU"/>
+        </w:rPr>
+      </w:pPr>
+      <w:r>
+        <w:rPr>
+          <w:rFonts w:ascii="Times New Roman" w:eastAsia="Times New Roman" w:hAnsi="Times New Roman" w:cs="Times New Roman"/>
+          <w:b/>
+          <w:bCs/>
+          <w:sz w:val="28"/>
+          <w:szCs w:val="28"/>
+          <w:lang w:eastAsia="ru-RU"/>
+        </w:rPr>
+        <w:t>2-й слой (MAXNET — Выделение победителя):</w:t>
+      </w:r>
+      <w:r>
+        <w:rPr>
+          <w:rFonts w:ascii="Times New Roman" w:eastAsia="Times New Roman" w:hAnsi="Times New Roman" w:cs="Times New Roman"/>
+          <w:sz w:val="28"/>
+          <w:szCs w:val="28"/>
+          <w:lang w:eastAsia="ru-RU"/>
+        </w:rPr>
+        <w:br/>
+        <w:t>Выход первого слоя подается на вход рекуррентной сети MAXNET. Матрица весов второго слоя имеет размер </w:t>
+      </w:r>
+      <w:proofErr w:type="spellStart"/>
+      <w:r>
+        <w:rPr>
+          <w:rFonts w:ascii="Times New Roman" w:eastAsia="Times New Roman" w:hAnsi="Times New Roman" w:cs="Times New Roman"/>
+          <w:sz w:val="28"/>
+          <w:szCs w:val="28"/>
+          <w:bdr w:val="none" w:sz="0" w:space="0" w:color="auto" w:frame="1"/>
+          <w:lang w:eastAsia="ru-RU"/>
+        </w:rPr>
+        <w:t>m×m</w:t>
+      </w:r>
+      <w:proofErr w:type="spellEnd"/>
+      <w:r>
+        <w:rPr>
+          <w:rFonts w:ascii="Times New Roman" w:eastAsia="Times New Roman" w:hAnsi="Times New Roman" w:cs="Times New Roman"/>
+          <w:sz w:val="28"/>
+          <w:szCs w:val="28"/>
+          <w:lang w:eastAsia="ru-RU"/>
+        </w:rPr>
+        <w:t> и выглядит следующим образом (где </w:t>
+      </w:r>
+      <w:r>
+        <w:rPr>
+          <w:rFonts w:ascii="Times New Roman" w:eastAsia="Times New Roman" w:hAnsi="Times New Roman" w:cs="Times New Roman"/>
+          <w:sz w:val="28"/>
+          <w:szCs w:val="28"/>
+          <w:bdr w:val="none" w:sz="0" w:space="0" w:color="auto" w:frame="1"/>
+          <w:lang w:eastAsia="ru-RU"/>
+        </w:rPr>
+        <w:t>0&lt;ϵ&lt;1/m</w:t>
+      </w:r>
+      <w:proofErr w:type="gramStart"/>
+      <w:r>
+        <w:rPr>
+          <w:rFonts w:ascii="Times New Roman" w:eastAsia="Times New Roman" w:hAnsi="Times New Roman" w:cs="Times New Roman"/>
+          <w:sz w:val="28"/>
+          <w:szCs w:val="28"/>
+          <w:lang w:eastAsia="ru-RU"/>
+        </w:rPr>
+        <w:t>) :</w:t>
+      </w:r>
+      <w:proofErr w:type="gramEnd"/>
+    </w:p>
+    <w:p>
+      <w:pPr>
+        <w:spacing w:after="0" w:line="240" w:lineRule="auto"/>
+        <w:ind w:firstLine="709"/>
+        <w:jc w:val="both"/>
+        <w:rPr>
+          <w:rFonts w:ascii="Times New Roman" w:eastAsia="Times New Roman" w:hAnsi="Times New Roman" w:cs="Times New Roman"/>
+          <w:sz w:val="28"/>
+          <w:szCs w:val="28"/>
+          <w:bdr w:val="none" w:sz="0" w:space="0" w:color="auto" w:frame="1"/>
+          <w:shd w:val="clear" w:color="auto" w:fill="151517"/>
+          <w:lang w:eastAsia="ru-RU"/>
+        </w:rPr>
+      </w:pPr>
+      <w:r>
+        <w:rPr>
+          <w:rFonts w:ascii="Times New Roman" w:hAnsi="Times New Roman" w:cs="Times New Roman"/>
+          <w:noProof/>
+          <w:sz w:val="28"/>
+          <w:szCs w:val="28"/>
+          <w:lang w:eastAsia="ru-RU"/>
+        </w:rPr>
+        <w:drawing>
+          <wp:inline distT="0" distB="0" distL="0" distR="0" wp14:anchorId="3DBF9703" wp14:editId="7A1112B9">
+            <wp:extent cx="2809875" cy="1343025"/>
+            <wp:effectExtent l="0" t="0" r="9525" b="9525"/>
+            <wp:docPr id="9" name="Рисунок 9"/>
+            <wp:cNvGraphicFramePr>
+              <a:graphicFrameLocks xmlns:a="http://schemas.openxmlformats.org/drawingml/2006/main" noChangeAspect="1"/>
+            </wp:cNvGraphicFramePr>
+            <a:graphic xmlns:a="http://schemas.openxmlformats.org/drawingml/2006/main">
+              <a:graphicData uri="http://schemas.openxmlformats.org/drawingml/2006/picture">
+                <pic:pic xmlns:pic="http://schemas.openxmlformats.org/drawingml/2006/picture">
+                  <pic:nvPicPr>
+                    <pic:cNvPr id="1" name=""/>
+                    <pic:cNvPicPr/>
+                  </pic:nvPicPr>
+                  <pic:blipFill>
+                    <a:blip r:embed="rId12"/>
+                    <a:stretch>
+                      <a:fillRect/>
+                    </a:stretch>
+                  </pic:blipFill>
+                  <pic:spPr>
+                    <a:xfrm>
+                      <a:off x="0" y="0"/>
+                      <a:ext cx="2809875" cy="1343025"/>
+                    </a:xfrm>
+                    <a:prstGeom prst="rect">
+                      <a:avLst/>
+                    </a:prstGeom>
+                  </pic:spPr>
+                </pic:pic>
+              </a:graphicData>
+            </a:graphic>
+          </wp:inline>
+        </w:drawing>
+      </w:r>
+    </w:p>
+    <w:p>
+      <w:pPr>
+        <w:spacing w:after="0" w:line="240" w:lineRule="auto"/>
+        <w:ind w:firstLine="709"/>
+        <w:rPr>
+          <w:rFonts w:ascii="Times New Roman" w:eastAsia="Times New Roman" w:hAnsi="Times New Roman" w:cs="Times New Roman"/>
+          <w:sz w:val="28"/>
+          <w:szCs w:val="28"/>
+          <w:lang w:eastAsia="ru-RU"/>
+        </w:rPr>
+      </w:pPr>
+      <w:r>
+        <w:rPr>
+          <w:rFonts w:ascii="Times New Roman" w:eastAsia="Times New Roman" w:hAnsi="Times New Roman" w:cs="Times New Roman"/>
+          <w:b/>
+          <w:bCs/>
+          <w:sz w:val="28"/>
+          <w:szCs w:val="28"/>
+          <w:lang w:eastAsia="ru-RU"/>
+        </w:rPr>
+        <w:t>Итерационный процесс:</w:t>
+      </w:r>
+      <w:r>
+        <w:rPr>
+          <w:rFonts w:ascii="Times New Roman" w:eastAsia="Times New Roman" w:hAnsi="Times New Roman" w:cs="Times New Roman"/>
+          <w:sz w:val="28"/>
+          <w:szCs w:val="28"/>
+          <w:lang w:eastAsia="ru-RU"/>
+        </w:rPr>
+        <w:br/>
+        <w:t>Состояние слоя MAXNET обновляется синхронно по правилу:</w:t>
+      </w:r>
+    </w:p>
+    <w:p>
+      <w:pPr>
+        <w:spacing w:after="0" w:line="240" w:lineRule="auto"/>
+        <w:ind w:firstLine="709"/>
+        <w:jc w:val="both"/>
+        <w:rPr>
+          <w:rFonts w:ascii="Times New Roman" w:eastAsia="Times New Roman" w:hAnsi="Times New Roman" w:cs="Times New Roman"/>
+          <w:sz w:val="28"/>
+          <w:szCs w:val="28"/>
+          <w:lang w:eastAsia="ru-RU"/>
+        </w:rPr>
+      </w:pPr>
+      <w:r>
+        <w:rPr>
+          <w:rFonts w:ascii="Times New Roman" w:hAnsi="Times New Roman" w:cs="Times New Roman"/>
+          <w:noProof/>
+          <w:sz w:val="28"/>
+          <w:szCs w:val="28"/>
+          <w:lang w:eastAsia="ru-RU"/>
+        </w:rPr>
+        <w:drawing>
+          <wp:inline distT="0" distB="0" distL="0" distR="0" wp14:anchorId="0232703D" wp14:editId="640891C0">
+            <wp:extent cx="3600450" cy="923925"/>
+            <wp:effectExtent l="0" t="0" r="0" b="9525"/>
+            <wp:docPr id="10" name="Рисунок 10"/>
+            <wp:cNvGraphicFramePr>
+              <a:graphicFrameLocks xmlns:a="http://schemas.openxmlformats.org/drawingml/2006/main" noChangeAspect="1"/>
+            </wp:cNvGraphicFramePr>
+            <a:graphic xmlns:a="http://schemas.openxmlformats.org/drawingml/2006/main">
+              <a:graphicData uri="http://schemas.openxmlformats.org/drawingml/2006/picture">
+                <pic:pic xmlns:pic="http://schemas.openxmlformats.org/drawingml/2006/picture">
+                  <pic:nvPicPr>
+                    <pic:cNvPr id="1" name=""/>
+                    <pic:cNvPicPr/>
+                  </pic:nvPicPr>
+                  <pic:blipFill>
+                    <a:blip r:embed="rId13"/>
+                    <a:stretch>
+                      <a:fillRect/>
+                    </a:stretch>
+                  </pic:blipFill>
+                  <pic:spPr>
+                    <a:xfrm>
+                      <a:off x="0" y="0"/>
+                      <a:ext cx="3600450" cy="923925"/>
+                    </a:xfrm>
+                    <a:prstGeom prst="rect">
+                      <a:avLst/>
+                    </a:prstGeom>
+                  </pic:spPr>
+                </pic:pic>
+              </a:graphicData>
+            </a:graphic>
+          </wp:inline>
+        </w:drawing>
+      </w:r>
+    </w:p>
+    <w:p>
+      <w:pPr>
+        <w:spacing w:after="0" w:line="240" w:lineRule="auto"/>
+        <w:ind w:firstLine="709"/>
+        <w:jc w:val="both"/>
+        <w:rPr>
+          <w:rFonts w:ascii="Times New Roman" w:eastAsia="Times New Roman" w:hAnsi="Times New Roman" w:cs="Times New Roman"/>
+          <w:sz w:val="28"/>
+          <w:szCs w:val="28"/>
+          <w:lang w:eastAsia="ru-RU"/>
+        </w:rPr>
+      </w:pPr>
+      <w:r>
+        <w:rPr>
+          <w:rFonts w:ascii="Times New Roman" w:eastAsia="Times New Roman" w:hAnsi="Times New Roman" w:cs="Times New Roman"/>
+          <w:sz w:val="28"/>
+          <w:szCs w:val="28"/>
+          <w:lang w:eastAsia="ru-RU"/>
+        </w:rPr>
+        <w:t>где </w:t>
+      </w:r>
+      <w:r>
+        <w:rPr>
+          <w:rFonts w:ascii="Times New Roman" w:eastAsia="Times New Roman" w:hAnsi="Times New Roman" w:cs="Times New Roman"/>
+          <w:sz w:val="28"/>
+          <w:szCs w:val="28"/>
+          <w:bdr w:val="none" w:sz="0" w:space="0" w:color="auto" w:frame="1"/>
+          <w:lang w:eastAsia="ru-RU"/>
+        </w:rPr>
+        <w:t>f</w:t>
+      </w:r>
+      <w:r>
+        <w:rPr>
+          <w:rFonts w:ascii="Times New Roman" w:eastAsia="Times New Roman" w:hAnsi="Times New Roman" w:cs="Times New Roman"/>
+          <w:sz w:val="28"/>
+          <w:szCs w:val="28"/>
+          <w:lang w:eastAsia="ru-RU"/>
+        </w:rPr>
+        <w:t xml:space="preserve"> — функция активации (линейный ограничитель или </w:t>
+      </w:r>
+      <w:proofErr w:type="spellStart"/>
+      <w:r>
+        <w:rPr>
+          <w:rFonts w:ascii="Times New Roman" w:eastAsia="Times New Roman" w:hAnsi="Times New Roman" w:cs="Times New Roman"/>
+          <w:sz w:val="28"/>
+          <w:szCs w:val="28"/>
+          <w:lang w:eastAsia="ru-RU"/>
+        </w:rPr>
+        <w:t>ReLU</w:t>
+      </w:r>
+      <w:proofErr w:type="spellEnd"/>
+      <w:r>
+        <w:rPr>
+          <w:rFonts w:ascii="Times New Roman" w:eastAsia="Times New Roman" w:hAnsi="Times New Roman" w:cs="Times New Roman"/>
+          <w:sz w:val="28"/>
+          <w:szCs w:val="28"/>
+          <w:lang w:eastAsia="ru-RU"/>
+        </w:rPr>
+        <w:t>). Через несколько итераций только один нейрон (с максимальным начальным сигналом) будет иметь положительное значение, остальные станут нулями.</w:t>
+      </w:r>
+    </w:p>
+    <w:p>
+      <w:pPr>
+        <w:spacing w:after="0" w:line="240" w:lineRule="auto"/>
+        <w:ind w:firstLine="709"/>
+        <w:jc w:val="both"/>
+        <w:rPr>
+          <w:rFonts w:ascii="Times New Roman" w:eastAsia="Times New Roman" w:hAnsi="Times New Roman" w:cs="Times New Roman"/>
+          <w:color w:val="F9FAFB"/>
+          <w:sz w:val="28"/>
+          <w:szCs w:val="28"/>
+          <w:lang w:eastAsia="ru-RU"/>
+        </w:rPr>
+      </w:pPr>
+    </w:p>
+    <w:p>
+      <w:pPr>
+        <w:pStyle w:val="3"/>
+        <w:spacing w:before="0" w:beforeAutospacing="0" w:after="0" w:afterAutospacing="0"/>
+        <w:ind w:firstLine="709"/>
+        <w:jc w:val="center"/>
+        <w:rPr>
+          <w:sz w:val="28"/>
+          <w:szCs w:val="28"/>
+        </w:rPr>
+      </w:pPr>
+      <w:r>
+        <w:rPr>
+          <w:sz w:val="28"/>
+          <w:szCs w:val="28"/>
+        </w:rPr>
+        <w:lastRenderedPageBreak/>
+        <w:t xml:space="preserve">Исследование модели </w:t>
+      </w:r>
+      <w:proofErr w:type="spellStart"/>
+      <w:r>
+        <w:rPr>
+          <w:sz w:val="28"/>
+          <w:szCs w:val="28"/>
+        </w:rPr>
+        <w:t>мемристора</w:t>
+      </w:r>
+      <w:proofErr w:type="spellEnd"/>
+      <w:r>
+        <w:rPr>
+          <w:sz w:val="28"/>
+          <w:szCs w:val="28"/>
+        </w:rPr>
+        <w:t xml:space="preserve"> в </w:t>
+      </w:r>
+      <w:proofErr w:type="spellStart"/>
+      <w:r>
+        <w:rPr>
+          <w:sz w:val="28"/>
+          <w:szCs w:val="28"/>
+        </w:rPr>
+        <w:t>Electronics</w:t>
+      </w:r>
+      <w:proofErr w:type="spellEnd"/>
+      <w:r>
+        <w:rPr>
+          <w:sz w:val="28"/>
+          <w:szCs w:val="28"/>
+        </w:rPr>
+        <w:t xml:space="preserve"> </w:t>
+      </w:r>
+      <w:proofErr w:type="spellStart"/>
+      <w:r>
+        <w:rPr>
+          <w:sz w:val="28"/>
+          <w:szCs w:val="28"/>
+        </w:rPr>
+        <w:t>Workbench</w:t>
+      </w:r>
+      <w:proofErr w:type="spellEnd"/>
+      <w:r>
+        <w:rPr>
+          <w:sz w:val="28"/>
+          <w:szCs w:val="28"/>
+        </w:rPr>
+        <w:t xml:space="preserve"> (EWB)</w:t>
+      </w:r>
+      <w:r>
+        <w:rPr>
+          <w:sz w:val="28"/>
+          <w:szCs w:val="28"/>
+        </w:rPr>
+        <w:t>.</w:t>
+      </w:r>
+    </w:p>
+    <w:p>
+      <w:pPr>
+        <w:pStyle w:val="3"/>
+        <w:spacing w:before="0" w:beforeAutospacing="0" w:after="0" w:afterAutospacing="0"/>
+        <w:ind w:firstLine="709"/>
+        <w:jc w:val="center"/>
+        <w:rPr>
+          <w:sz w:val="28"/>
+          <w:szCs w:val="28"/>
+        </w:rPr>
+      </w:pPr>
+    </w:p>
+    <w:p>
+      <w:pPr>
+        <w:pStyle w:val="ds-markdown-paragraph"/>
+        <w:spacing w:before="0" w:beforeAutospacing="0" w:after="0" w:afterAutospacing="0"/>
+        <w:ind w:firstLine="709"/>
+        <w:jc w:val="both"/>
+        <w:rPr>
+          <w:sz w:val="28"/>
+          <w:szCs w:val="28"/>
+        </w:rPr>
+      </w:pPr>
+      <w:proofErr w:type="spellStart"/>
+      <w:r>
+        <w:rPr>
+          <w:rStyle w:val="a6"/>
+          <w:sz w:val="28"/>
+          <w:szCs w:val="28"/>
+        </w:rPr>
+        <w:t>Мемристор</w:t>
+      </w:r>
+      <w:proofErr w:type="spellEnd"/>
+      <w:r>
+        <w:rPr>
+          <w:rStyle w:val="a6"/>
+          <w:sz w:val="28"/>
+          <w:szCs w:val="28"/>
+        </w:rPr>
+        <w:t xml:space="preserve"> (резистор с памятью)</w:t>
+      </w:r>
+      <w:r>
+        <w:rPr>
+          <w:sz w:val="28"/>
+          <w:szCs w:val="28"/>
+        </w:rPr>
+        <w:t> — это пассивный компонент, сопротивление которого зависит от протекавшего ранее заряда. Он идеально подходит для аппаратной реализации нейронных сетей, так как может напрямую выступать в роли синапса (веса связи), хранящего значение "1" (низкое сопротивление) или "-1" (высокое сопротивление).</w:t>
+      </w:r>
+    </w:p>
+    <w:p>
+      <w:pPr>
+        <w:pStyle w:val="ds-markdown-paragraph"/>
+        <w:spacing w:before="0" w:beforeAutospacing="0" w:after="0" w:afterAutospacing="0"/>
+        <w:ind w:firstLine="709"/>
+        <w:jc w:val="both"/>
+        <w:rPr>
+          <w:sz w:val="28"/>
+          <w:szCs w:val="28"/>
+        </w:rPr>
+      </w:pPr>
+      <w:r>
+        <w:rPr>
+          <w:rStyle w:val="a6"/>
+          <w:sz w:val="28"/>
+          <w:szCs w:val="28"/>
+        </w:rPr>
+        <w:t xml:space="preserve">Исследование в </w:t>
+      </w:r>
+      <w:proofErr w:type="spellStart"/>
+      <w:r>
+        <w:rPr>
+          <w:rStyle w:val="a6"/>
+          <w:sz w:val="28"/>
+          <w:szCs w:val="28"/>
+        </w:rPr>
+        <w:t>Electronics</w:t>
+      </w:r>
+      <w:proofErr w:type="spellEnd"/>
+      <w:r>
+        <w:rPr>
+          <w:rStyle w:val="a6"/>
+          <w:sz w:val="28"/>
+          <w:szCs w:val="28"/>
+        </w:rPr>
+        <w:t xml:space="preserve"> </w:t>
+      </w:r>
+      <w:proofErr w:type="spellStart"/>
+      <w:r>
+        <w:rPr>
+          <w:rStyle w:val="a6"/>
+          <w:sz w:val="28"/>
+          <w:szCs w:val="28"/>
+        </w:rPr>
+        <w:t>Workbench</w:t>
+      </w:r>
+      <w:proofErr w:type="spellEnd"/>
+      <w:r>
+        <w:rPr>
+          <w:rStyle w:val="a6"/>
+          <w:sz w:val="28"/>
+          <w:szCs w:val="28"/>
+        </w:rPr>
+        <w:t>:</w:t>
+      </w:r>
+      <w:r>
+        <w:rPr>
+          <w:sz w:val="28"/>
+          <w:szCs w:val="28"/>
+        </w:rPr>
+        <w:br/>
+        <w:t xml:space="preserve">Поскольку в стандартной библиотеке EWB нет готового </w:t>
+      </w:r>
+      <w:proofErr w:type="spellStart"/>
+      <w:r>
+        <w:rPr>
+          <w:sz w:val="28"/>
+          <w:szCs w:val="28"/>
+        </w:rPr>
+        <w:t>мемристора</w:t>
+      </w:r>
+      <w:proofErr w:type="spellEnd"/>
+      <w:r>
+        <w:rPr>
+          <w:sz w:val="28"/>
+          <w:szCs w:val="28"/>
+        </w:rPr>
+        <w:t>, его свойства моделируют с помощью </w:t>
+      </w:r>
+      <w:r>
+        <w:rPr>
+          <w:rStyle w:val="a6"/>
+          <w:sz w:val="28"/>
+          <w:szCs w:val="28"/>
+        </w:rPr>
+        <w:t>эквивалентной схемы</w:t>
+      </w:r>
+      <w:r>
+        <w:rPr>
+          <w:sz w:val="28"/>
+          <w:szCs w:val="28"/>
+        </w:rPr>
+        <w:t>.</w:t>
+      </w:r>
+    </w:p>
+    <w:p>
+      <w:pPr>
+        <w:pStyle w:val="ds-markdown-paragraph"/>
+        <w:spacing w:before="0" w:beforeAutospacing="0" w:after="0" w:afterAutospacing="0"/>
+        <w:ind w:firstLine="709"/>
+        <w:jc w:val="both"/>
+        <w:rPr>
+          <w:sz w:val="28"/>
+          <w:szCs w:val="28"/>
+        </w:rPr>
+      </w:pPr>
+      <w:r>
+        <w:rPr>
+          <w:rStyle w:val="a6"/>
+          <w:sz w:val="28"/>
+          <w:szCs w:val="28"/>
+        </w:rPr>
+        <w:t>Методика моделирования:</w:t>
+      </w:r>
+    </w:p>
+    <w:p>
+      <w:pPr>
+        <w:pStyle w:val="ds-markdown-paragraph"/>
+        <w:numPr>
+          <w:ilvl w:val="0"/>
+          <w:numId w:val="37"/>
+        </w:numPr>
+        <w:spacing w:before="0" w:beforeAutospacing="0" w:after="0" w:afterAutospacing="0"/>
+        <w:ind w:left="0" w:firstLine="709"/>
+        <w:jc w:val="both"/>
+        <w:rPr>
+          <w:sz w:val="28"/>
+          <w:szCs w:val="28"/>
+        </w:rPr>
+      </w:pPr>
+      <w:r>
+        <w:rPr>
+          <w:rStyle w:val="a6"/>
+          <w:sz w:val="28"/>
+          <w:szCs w:val="28"/>
+        </w:rPr>
+        <w:t>Сборка схемы:</w:t>
+      </w:r>
+    </w:p>
+    <w:p>
+      <w:pPr>
+        <w:pStyle w:val="ds-markdown-paragraph"/>
+        <w:numPr>
+          <w:ilvl w:val="1"/>
+          <w:numId w:val="37"/>
+        </w:numPr>
+        <w:spacing w:before="0" w:beforeAutospacing="0" w:after="0" w:afterAutospacing="0"/>
+        <w:ind w:left="0" w:firstLine="709"/>
+        <w:jc w:val="both"/>
+        <w:rPr>
+          <w:sz w:val="28"/>
+          <w:szCs w:val="28"/>
+        </w:rPr>
+      </w:pPr>
+      <w:r>
+        <w:rPr>
+          <w:sz w:val="28"/>
+          <w:szCs w:val="28"/>
+        </w:rPr>
+        <w:t xml:space="preserve">Собирается функциональная схема, имитирующая поведение </w:t>
+      </w:r>
+      <w:proofErr w:type="spellStart"/>
+      <w:r>
+        <w:rPr>
+          <w:sz w:val="28"/>
+          <w:szCs w:val="28"/>
+        </w:rPr>
+        <w:t>мемристора</w:t>
+      </w:r>
+      <w:proofErr w:type="spellEnd"/>
+      <w:r>
+        <w:rPr>
+          <w:sz w:val="28"/>
+          <w:szCs w:val="28"/>
+        </w:rPr>
+        <w:t xml:space="preserve">. Обычно она включает операционные усилители, аналоговые </w:t>
+      </w:r>
+      <w:proofErr w:type="spellStart"/>
+      <w:r>
+        <w:rPr>
+          <w:sz w:val="28"/>
+          <w:szCs w:val="28"/>
+        </w:rPr>
+        <w:t>перемножители</w:t>
+      </w:r>
+      <w:proofErr w:type="spellEnd"/>
+      <w:r>
+        <w:rPr>
+          <w:sz w:val="28"/>
+          <w:szCs w:val="28"/>
+        </w:rPr>
+        <w:t xml:space="preserve"> и интеграторы.</w:t>
+      </w:r>
+    </w:p>
+    <w:p>
+      <w:pPr>
+        <w:pStyle w:val="ds-markdown-paragraph"/>
+        <w:numPr>
+          <w:ilvl w:val="1"/>
+          <w:numId w:val="37"/>
+        </w:numPr>
+        <w:spacing w:before="0" w:beforeAutospacing="0" w:after="0" w:afterAutospacing="0"/>
+        <w:ind w:left="0" w:firstLine="709"/>
+        <w:jc w:val="both"/>
+        <w:rPr>
+          <w:sz w:val="28"/>
+          <w:szCs w:val="28"/>
+        </w:rPr>
+      </w:pPr>
+      <w:r>
+        <w:rPr>
+          <w:sz w:val="28"/>
+          <w:szCs w:val="28"/>
+        </w:rPr>
+        <w:t>Схема состоит из блока измерения тока, блока управления сопротивлением и управляемого резистора.</w:t>
+      </w:r>
+    </w:p>
+    <w:p>
+      <w:pPr>
+        <w:pStyle w:val="ds-markdown-paragraph"/>
+        <w:numPr>
+          <w:ilvl w:val="0"/>
+          <w:numId w:val="37"/>
+        </w:numPr>
+        <w:spacing w:before="0" w:beforeAutospacing="0" w:after="0" w:afterAutospacing="0"/>
+        <w:ind w:left="0" w:firstLine="709"/>
+        <w:jc w:val="both"/>
+        <w:rPr>
+          <w:sz w:val="28"/>
+          <w:szCs w:val="28"/>
+        </w:rPr>
+      </w:pPr>
+      <w:r>
+        <w:rPr>
+          <w:rStyle w:val="a6"/>
+          <w:sz w:val="28"/>
+          <w:szCs w:val="28"/>
+        </w:rPr>
+        <w:t>Подключение приборов:</w:t>
+      </w:r>
+    </w:p>
+    <w:p>
+      <w:pPr>
+        <w:pStyle w:val="ds-markdown-paragraph"/>
+        <w:numPr>
+          <w:ilvl w:val="1"/>
+          <w:numId w:val="37"/>
+        </w:numPr>
+        <w:spacing w:before="0" w:beforeAutospacing="0" w:after="0" w:afterAutospacing="0"/>
+        <w:ind w:left="0" w:firstLine="709"/>
+        <w:jc w:val="both"/>
+        <w:rPr>
+          <w:sz w:val="28"/>
+          <w:szCs w:val="28"/>
+        </w:rPr>
+      </w:pPr>
+      <w:r>
+        <w:rPr>
+          <w:sz w:val="28"/>
+          <w:szCs w:val="28"/>
+        </w:rPr>
+        <w:t>К модели подключается источник переменного тока.</w:t>
+      </w:r>
+    </w:p>
+    <w:p>
+      <w:pPr>
+        <w:pStyle w:val="ds-markdown-paragraph"/>
+        <w:numPr>
+          <w:ilvl w:val="1"/>
+          <w:numId w:val="37"/>
+        </w:numPr>
+        <w:spacing w:before="0" w:beforeAutospacing="0" w:after="0" w:afterAutospacing="0"/>
+        <w:ind w:left="0" w:firstLine="709"/>
+        <w:jc w:val="both"/>
+        <w:rPr>
+          <w:sz w:val="28"/>
+          <w:szCs w:val="28"/>
+        </w:rPr>
+      </w:pPr>
+      <w:r>
+        <w:rPr>
+          <w:sz w:val="28"/>
+          <w:szCs w:val="28"/>
+        </w:rPr>
+        <w:t>Используется осциллограф в режиме </w:t>
+      </w:r>
+      <w:r>
+        <w:rPr>
+          <w:rStyle w:val="a6"/>
+          <w:sz w:val="28"/>
+          <w:szCs w:val="28"/>
+        </w:rPr>
+        <w:t>"X-Y"</w:t>
+      </w:r>
+      <w:r>
+        <w:rPr>
+          <w:sz w:val="28"/>
+          <w:szCs w:val="28"/>
+        </w:rPr>
+        <w:t> (по осям откладывается ток и напряжение).</w:t>
+      </w:r>
+    </w:p>
+    <w:p>
+      <w:pPr>
+        <w:pStyle w:val="ds-markdown-paragraph"/>
+        <w:numPr>
+          <w:ilvl w:val="0"/>
+          <w:numId w:val="37"/>
+        </w:numPr>
+        <w:spacing w:before="0" w:beforeAutospacing="0" w:after="0" w:afterAutospacing="0"/>
+        <w:ind w:left="0" w:firstLine="709"/>
+        <w:jc w:val="both"/>
+        <w:rPr>
+          <w:sz w:val="28"/>
+          <w:szCs w:val="28"/>
+        </w:rPr>
+      </w:pPr>
+      <w:r>
+        <w:rPr>
+          <w:rStyle w:val="a6"/>
+          <w:sz w:val="28"/>
+          <w:szCs w:val="28"/>
+        </w:rPr>
+        <w:t>Анализ результатов:</w:t>
+      </w:r>
+    </w:p>
+    <w:p>
+      <w:pPr>
+        <w:pStyle w:val="ds-markdown-paragraph"/>
+        <w:numPr>
+          <w:ilvl w:val="1"/>
+          <w:numId w:val="37"/>
+        </w:numPr>
+        <w:spacing w:before="0" w:beforeAutospacing="0" w:after="0" w:afterAutospacing="0"/>
+        <w:ind w:left="0" w:firstLine="709"/>
+        <w:jc w:val="both"/>
+        <w:rPr>
+          <w:sz w:val="28"/>
+          <w:szCs w:val="28"/>
+        </w:rPr>
+      </w:pPr>
+      <w:r>
+        <w:rPr>
+          <w:sz w:val="28"/>
+          <w:szCs w:val="28"/>
+        </w:rPr>
+        <w:t>При подаче синусоидального сигнала на экране осциллографа должна наблюдаться </w:t>
+      </w:r>
+      <w:r>
+        <w:rPr>
+          <w:rStyle w:val="a6"/>
+          <w:sz w:val="28"/>
+          <w:szCs w:val="28"/>
+        </w:rPr>
+        <w:t>петля гистерезиса</w:t>
+      </w:r>
+      <w:r>
+        <w:rPr>
+          <w:sz w:val="28"/>
+          <w:szCs w:val="28"/>
+        </w:rPr>
+        <w:t xml:space="preserve">. Это характерная </w:t>
+      </w:r>
+      <w:r>
+        <w:rPr>
+          <w:sz w:val="28"/>
+          <w:szCs w:val="28"/>
+        </w:rPr>
+        <w:t>вольтамперная</w:t>
+      </w:r>
+      <w:r>
+        <w:rPr>
+          <w:sz w:val="28"/>
+          <w:szCs w:val="28"/>
+        </w:rPr>
+        <w:t xml:space="preserve"> характеристика (ВАХ) </w:t>
+      </w:r>
+      <w:proofErr w:type="spellStart"/>
+      <w:r>
+        <w:rPr>
+          <w:sz w:val="28"/>
+          <w:szCs w:val="28"/>
+        </w:rPr>
+        <w:t>мемристора</w:t>
+      </w:r>
+      <w:proofErr w:type="spellEnd"/>
+      <w:r>
+        <w:rPr>
+          <w:sz w:val="28"/>
+          <w:szCs w:val="28"/>
+        </w:rPr>
+        <w:t>.</w:t>
+      </w:r>
+    </w:p>
+    <w:p>
+      <w:pPr>
+        <w:pStyle w:val="ds-markdown-paragraph"/>
+        <w:numPr>
+          <w:ilvl w:val="1"/>
+          <w:numId w:val="37"/>
+        </w:numPr>
+        <w:spacing w:before="0" w:beforeAutospacing="0" w:after="0" w:afterAutospacing="0"/>
+        <w:ind w:left="0" w:firstLine="709"/>
+        <w:jc w:val="both"/>
+        <w:rPr>
+          <w:sz w:val="28"/>
+          <w:szCs w:val="28"/>
+        </w:rPr>
+      </w:pPr>
+      <w:r>
+        <w:rPr>
+          <w:sz w:val="28"/>
+          <w:szCs w:val="28"/>
+        </w:rPr>
+        <w:t>Форма "восьмерки" или "наклонной восьмерки" петли указывает на то, что сопротивление элемента меняется со временем в зависимости от направления тока. При нулевом токе сопротивление сохраняется (память).</w:t>
+      </w:r>
+    </w:p>
+    <w:p>
+      <w:pPr>
+        <w:pStyle w:val="ds-markdown-paragraph"/>
+        <w:spacing w:before="0" w:beforeAutospacing="0" w:after="0" w:afterAutospacing="0"/>
+        <w:ind w:firstLine="709"/>
+        <w:jc w:val="both"/>
+        <w:rPr>
+          <w:sz w:val="28"/>
+          <w:szCs w:val="28"/>
+        </w:rPr>
+      </w:pPr>
+      <w:r>
+        <w:rPr>
+          <w:rStyle w:val="a6"/>
+          <w:sz w:val="28"/>
+          <w:szCs w:val="28"/>
+        </w:rPr>
+        <w:t>Вывод по исследованию:</w:t>
+      </w:r>
+      <w:r>
+        <w:rPr>
+          <w:sz w:val="28"/>
+          <w:szCs w:val="28"/>
+        </w:rPr>
+        <w:t xml:space="preserve"> Моделирование в EWB подтверждает, что </w:t>
+      </w:r>
+      <w:proofErr w:type="spellStart"/>
+      <w:r>
+        <w:rPr>
+          <w:sz w:val="28"/>
+          <w:szCs w:val="28"/>
+        </w:rPr>
+        <w:t>мемристор</w:t>
+      </w:r>
+      <w:proofErr w:type="spellEnd"/>
+      <w:r>
+        <w:rPr>
+          <w:sz w:val="28"/>
+          <w:szCs w:val="28"/>
+        </w:rPr>
+        <w:t xml:space="preserve"> может сохранять состояние после выключения питания. Это свойство позволяет использовать его для создания </w:t>
+      </w:r>
+      <w:r>
+        <w:rPr>
+          <w:rStyle w:val="a6"/>
+          <w:sz w:val="28"/>
+          <w:szCs w:val="28"/>
+        </w:rPr>
+        <w:t>энергонезависимых весов</w:t>
+      </w:r>
+      <w:r>
+        <w:rPr>
+          <w:sz w:val="28"/>
+          <w:szCs w:val="28"/>
+        </w:rPr>
+        <w:t> в нейронных сетях Хэмминга, в частности, в топологии "</w:t>
+      </w:r>
+      <w:proofErr w:type="spellStart"/>
+      <w:r>
+        <w:rPr>
+          <w:sz w:val="28"/>
+          <w:szCs w:val="28"/>
+        </w:rPr>
+        <w:t>Crossbar</w:t>
+      </w:r>
+      <w:proofErr w:type="spellEnd"/>
+      <w:r>
+        <w:rPr>
+          <w:sz w:val="28"/>
+          <w:szCs w:val="28"/>
+        </w:rPr>
+        <w:t xml:space="preserve">" (перекрестные связи), где каждый пересекающийся провод соединяется через </w:t>
+      </w:r>
+      <w:proofErr w:type="spellStart"/>
+      <w:r>
+        <w:rPr>
+          <w:sz w:val="28"/>
+          <w:szCs w:val="28"/>
+        </w:rPr>
+        <w:t>мемристор</w:t>
+      </w:r>
+      <w:proofErr w:type="spellEnd"/>
+      <w:r>
+        <w:rPr>
+          <w:sz w:val="28"/>
+          <w:szCs w:val="28"/>
+        </w:rPr>
+        <w:t>.</w:t>
+      </w:r>
+    </w:p>
+    <w:p>
+      <w:pPr>
+        <w:spacing w:after="0" w:line="240" w:lineRule="auto"/>
+        <w:ind w:left="709"/>
+        <w:rPr>
+          <w:rFonts w:ascii="Times New Roman" w:eastAsia="Times New Roman" w:hAnsi="Times New Roman" w:cs="Times New Roman"/>
+          <w:sz w:val="28"/>
+          <w:szCs w:val="28"/>
+          <w:lang w:eastAsia="ru-RU"/>
         </w:rPr>
       </w:pPr>
     </w:p>
@@ -1513,8 +4666,121 @@
 </file>
 
 <file path=word/numbering.xml><?xml version="1.0" encoding="utf-8"?>
-<w:numbering xmlns:wpc="http://schemas.microsoft.com/office/word/2010/wordprocessingCanvas" xmlns:cx="http://schemas.microsoft.com/office/drawing/2014/chartex" xmlns:cx1="http://schemas.microsoft.com/office/drawing/2015/9/8/chartex" xmlns:cx2="http://schemas.microsoft.com/office/drawing/2015/10/21/chartex" xmlns:cx3="http://schemas.microsoft.com/office/drawing/2016/5/9/chartex" xmlns:cx4="http://schemas.microsoft.com/office/drawing/2016/5/10/chartex" xmlns:cx5="http://schemas.microsoft.com/office/drawing/2016/5/11/chartex" xmlns:cx6="http://schemas.microsoft.com/office/drawing/2016/5/12/chartex" xmlns:cx7="http://schemas.microsoft.com/office/drawing/2016/5/13/chartex" xmlns:cx8="http://schemas.microsoft.com/office/drawing/2016/5/14/chartex" xmlns:mc="http://schemas.openxmlformats.org/markup-compatibility/2006" xmlns:aink="http://schemas.microsoft.com/office/drawing/2016/ink" xmlns:am3d="http://schemas.microsoft.com/office/drawing/2017/model3d" xmlns:o="urn:schemas-microsoft-com:office:office" xmlns:oel="http://schemas.microsoft.com/office/2019/extlst" xmlns:r="http://schemas.openxmlformats.org/officeDocument/2006/relationships" xmlns:m="http://schemas.openxmlformats.org/officeDocument/2006/math" xmlns:v="urn:schemas-microsoft-com:vml" xmlns:wp14="http://schemas.microsoft.com/office/word/2010/wordprocessingDrawing" xmlns:wp="http://schemas.openxmlformats.org/drawingml/2006/wordprocessingDrawing" xmlns:w10="urn:schemas-microsoft-com:office:word" xmlns:w="http://schemas.openxmlformats.org/wordprocessingml/2006/main" xmlns:w14="http://schemas.microsoft.com/office/word/2010/wordml" xmlns:w15="http://schemas.microsoft.com/office/word/2012/wordml" xmlns:w16cex="http://schemas.microsoft.com/office/word/2018/wordml/cex" xmlns:w16cid="http://schemas.microsoft.com/office/word/2016/wordml/cid" xmlns:w16="http://schemas.microsoft.com/office/word/2018/wordml" xmlns:w16sdtdh="http://schemas.microsoft.com/office/word/2020/wordml/sdtdatahash" xmlns:w16se="http://schemas.microsoft.com/office/word/2015/wordml/symex" xmlns:wpg="http://schemas.microsoft.com/office/word/2010/wordprocessingGroup" xmlns:wpi="http://schemas.microsoft.com/office/word/2010/wordprocessingInk" xmlns:wne="http://schemas.microsoft.com/office/word/2006/wordml" xmlns:wps="http://schemas.microsoft.com/office/word/2010/wordprocessingShape" mc:Ignorable="w14 w15 w16se w16cid w16 w16cex w16sdtdh wp14">
+<w:numbering xmlns:wpc="http://schemas.microsoft.com/office/word/2010/wordprocessingCanvas" xmlns:cx="http://schemas.microsoft.com/office/drawing/2014/chartex" xmlns:mc="http://schemas.openxmlformats.org/markup-compatibility/2006" xmlns:o="urn:schemas-microsoft-com:office:office" xmlns:r="http://schemas.openxmlformats.org/officeDocument/2006/relationships" xmlns:m="http://schemas.openxmlformats.org/officeDocument/2006/math" xmlns:v="urn:schemas-microsoft-com:vml" xmlns:wp14="http://schemas.microsoft.com/office/word/2010/wordprocessingDrawing" xmlns:wp="http://schemas.openxmlformats.org/drawingml/2006/wordprocessingDrawing" xmlns:w10="urn:schemas-microsoft-com:office:word" xmlns:w="http://schemas.openxmlformats.org/wordprocessingml/2006/main" xmlns:w14="http://schemas.microsoft.com/office/word/2010/wordml" xmlns:w15="http://schemas.microsoft.com/office/word/2012/wordml" xmlns:w16se="http://schemas.microsoft.com/office/word/2015/wordml/symex" xmlns:wpg="http://schemas.microsoft.com/office/word/2010/wordprocessingGroup" xmlns:wpi="http://schemas.microsoft.com/office/word/2010/wordprocessingInk" xmlns:wne="http://schemas.microsoft.com/office/word/2006/wordml" xmlns:wps="http://schemas.microsoft.com/office/word/2010/wordprocessingShape" mc:Ignorable="w14 w15 w16se wp14">
   <w:abstractNum w:abstractNumId="0" w15:restartNumberingAfterBreak="0">
+    <w:nsid w:val="036D1714"/>
+    <w:multiLevelType w:val="multilevel"/>
+    <w:tmpl w:val="409E832A"/>
+    <w:lvl w:ilvl="0">
+      <w:start w:val="1"/>
+      <w:numFmt w:val="decimal"/>
+      <w:lvlText w:val="%1."/>
+      <w:lvlJc w:val="left"/>
+      <w:pPr>
+        <w:tabs>
+          <w:tab w:val="num" w:pos="720"/>
+        </w:tabs>
+        <w:ind w:left="720" w:hanging="360"/>
+      </w:pPr>
+    </w:lvl>
+    <w:lvl w:ilvl="1" w:tentative="1">
+      <w:start w:val="1"/>
+      <w:numFmt w:val="decimal"/>
+      <w:lvlText w:val="%2."/>
+      <w:lvlJc w:val="left"/>
+      <w:pPr>
+        <w:tabs>
+          <w:tab w:val="num" w:pos="1440"/>
+        </w:tabs>
+        <w:ind w:left="1440" w:hanging="360"/>
+      </w:pPr>
+    </w:lvl>
+    <w:lvl w:ilvl="2" w:tentative="1">
+      <w:start w:val="1"/>
+      <w:numFmt w:val="decimal"/>
+      <w:lvlText w:val="%3."/>
+      <w:lvlJc w:val="left"/>
+      <w:pPr>
+        <w:tabs>
+          <w:tab w:val="num" w:pos="2160"/>
+        </w:tabs>
+        <w:ind w:left="2160" w:hanging="360"/>
+      </w:pPr>
+    </w:lvl>
+    <w:lvl w:ilvl="3" w:tentative="1">
+      <w:start w:val="1"/>
+      <w:numFmt w:val="decimal"/>
+      <w:lvlText w:val="%4."/>
+      <w:lvlJc w:val="left"/>
+      <w:pPr>
+        <w:tabs>
+          <w:tab w:val="num" w:pos="2880"/>
+        </w:tabs>
+        <w:ind w:left="2880" w:hanging="360"/>
+      </w:pPr>
+    </w:lvl>
+    <w:lvl w:ilvl="4" w:tentative="1">
+      <w:start w:val="1"/>
+      <w:numFmt w:val="decimal"/>
+      <w:lvlText w:val="%5."/>
+      <w:lvlJc w:val="left"/>
+      <w:pPr>
+        <w:tabs>
+          <w:tab w:val="num" w:pos="3600"/>
+        </w:tabs>
+        <w:ind w:left="3600" w:hanging="360"/>
+      </w:pPr>
+    </w:lvl>
+    <w:lvl w:ilvl="5" w:tentative="1">
+      <w:start w:val="1"/>
+      <w:numFmt w:val="decimal"/>
+      <w:lvlText w:val="%6."/>
+      <w:lvlJc w:val="left"/>
+      <w:pPr>
+        <w:tabs>
+          <w:tab w:val="num" w:pos="4320"/>
+        </w:tabs>
+        <w:ind w:left="4320" w:hanging="360"/>
+      </w:pPr>
+    </w:lvl>
+    <w:lvl w:ilvl="6" w:tentative="1">
+      <w:start w:val="1"/>
+      <w:numFmt w:val="decimal"/>
+      <w:lvlText w:val="%7."/>
+      <w:lvlJc w:val="left"/>
+      <w:pPr>
+        <w:tabs>
+          <w:tab w:val="num" w:pos="5040"/>
+        </w:tabs>
+        <w:ind w:left="5040" w:hanging="360"/>
+      </w:pPr>
+    </w:lvl>
+    <w:lvl w:ilvl="7" w:tentative="1">
+      <w:start w:val="1"/>
+      <w:numFmt w:val="decimal"/>
+      <w:lvlText w:val="%8."/>
+      <w:lvlJc w:val="left"/>
+      <w:pPr>
+        <w:tabs>
+          <w:tab w:val="num" w:pos="5760"/>
+        </w:tabs>
+        <w:ind w:left="5760" w:hanging="360"/>
+      </w:pPr>
+    </w:lvl>
+    <w:lvl w:ilvl="8" w:tentative="1">
+      <w:start w:val="1"/>
+      <w:numFmt w:val="decimal"/>
+      <w:lvlText w:val="%9."/>
+      <w:lvlJc w:val="left"/>
+      <w:pPr>
+        <w:tabs>
+          <w:tab w:val="num" w:pos="6480"/>
+        </w:tabs>
+        <w:ind w:left="6480" w:hanging="360"/>
+      </w:pPr>
+    </w:lvl>
+  </w:abstractNum>
+  <w:abstractNum w:abstractNumId="1" w15:restartNumberingAfterBreak="0">
     <w:nsid w:val="05890E9A"/>
     <w:multiLevelType w:val="hybridMultilevel"/>
     <w:tmpl w:val="B8926D0A"/>
@@ -1627,7 +4893,7 @@
       </w:rPr>
     </w:lvl>
   </w:abstractNum>
-  <w:abstractNum w:abstractNumId="1" w15:restartNumberingAfterBreak="0">
+  <w:abstractNum w:abstractNumId="2" w15:restartNumberingAfterBreak="0">
     <w:nsid w:val="07E8076B"/>
     <w:multiLevelType w:val="multilevel"/>
     <w:tmpl w:val="64905DBE"/>
@@ -1744,7 +5010,7 @@
       </w:pPr>
     </w:lvl>
   </w:abstractNum>
-  <w:abstractNum w:abstractNumId="2" w15:restartNumberingAfterBreak="0">
+  <w:abstractNum w:abstractNumId="3" w15:restartNumberingAfterBreak="0">
     <w:nsid w:val="0B8106A1"/>
     <w:multiLevelType w:val="multilevel"/>
     <w:tmpl w:val="DCA2D2D6"/>
@@ -1857,7 +5123,7 @@
       </w:pPr>
     </w:lvl>
   </w:abstractNum>
-  <w:abstractNum w:abstractNumId="3" w15:restartNumberingAfterBreak="0">
+  <w:abstractNum w:abstractNumId="4" w15:restartNumberingAfterBreak="0">
     <w:nsid w:val="0D4E2EAC"/>
     <w:multiLevelType w:val="multilevel"/>
     <w:tmpl w:val="54689C7C"/>
@@ -1970,7 +5236,7 @@
       </w:pPr>
     </w:lvl>
   </w:abstractNum>
-  <w:abstractNum w:abstractNumId="4" w15:restartNumberingAfterBreak="0">
+  <w:abstractNum w:abstractNumId="5" w15:restartNumberingAfterBreak="0">
     <w:nsid w:val="0F6A19D7"/>
     <w:multiLevelType w:val="hybridMultilevel"/>
     <w:tmpl w:val="E1B0BEB2"/>
@@ -2083,7 +5349,7 @@
       </w:rPr>
     </w:lvl>
   </w:abstractNum>
-  <w:abstractNum w:abstractNumId="5" w15:restartNumberingAfterBreak="0">
+  <w:abstractNum w:abstractNumId="6" w15:restartNumberingAfterBreak="0">
     <w:nsid w:val="16F85904"/>
     <w:multiLevelType w:val="multilevel"/>
     <w:tmpl w:val="BB0C3128"/>
@@ -2233,7 +5499,7 @@
       </w:rPr>
     </w:lvl>
   </w:abstractNum>
-  <w:abstractNum w:abstractNumId="6" w15:restartNumberingAfterBreak="0">
+  <w:abstractNum w:abstractNumId="7" w15:restartNumberingAfterBreak="0">
     <w:nsid w:val="1C633A49"/>
     <w:multiLevelType w:val="multilevel"/>
     <w:tmpl w:val="890AE27C"/>
@@ -2382,7 +5648,7 @@
       </w:rPr>
     </w:lvl>
   </w:abstractNum>
-  <w:abstractNum w:abstractNumId="7" w15:restartNumberingAfterBreak="0">
+  <w:abstractNum w:abstractNumId="8" w15:restartNumberingAfterBreak="0">
     <w:nsid w:val="21433CB0"/>
     <w:multiLevelType w:val="multilevel"/>
     <w:tmpl w:val="CE1C82E8"/>
@@ -2531,7 +5797,7 @@
       </w:rPr>
     </w:lvl>
   </w:abstractNum>
-  <w:abstractNum w:abstractNumId="8" w15:restartNumberingAfterBreak="0">
+  <w:abstractNum w:abstractNumId="9" w15:restartNumberingAfterBreak="0">
     <w:nsid w:val="21697C47"/>
     <w:multiLevelType w:val="multilevel"/>
     <w:tmpl w:val="BB0C3128"/>
@@ -2681,7 +5947,7 @@
       </w:rPr>
     </w:lvl>
   </w:abstractNum>
-  <w:abstractNum w:abstractNumId="9" w15:restartNumberingAfterBreak="0">
+  <w:abstractNum w:abstractNumId="10" w15:restartNumberingAfterBreak="0">
     <w:nsid w:val="2899324E"/>
     <w:multiLevelType w:val="multilevel"/>
     <w:tmpl w:val="10109796"/>
@@ -2830,7 +6096,7 @@
       </w:rPr>
     </w:lvl>
   </w:abstractNum>
-  <w:abstractNum w:abstractNumId="10" w15:restartNumberingAfterBreak="0">
+  <w:abstractNum w:abstractNumId="11" w15:restartNumberingAfterBreak="0">
     <w:nsid w:val="2BD00D16"/>
     <w:multiLevelType w:val="hybridMultilevel"/>
     <w:tmpl w:val="8990CB0A"/>
@@ -2943,7 +6209,7 @@
       </w:rPr>
     </w:lvl>
   </w:abstractNum>
-  <w:abstractNum w:abstractNumId="11" w15:restartNumberingAfterBreak="0">
+  <w:abstractNum w:abstractNumId="12" w15:restartNumberingAfterBreak="0">
     <w:nsid w:val="2CA027F5"/>
     <w:multiLevelType w:val="multilevel"/>
     <w:tmpl w:val="566E525C"/>
@@ -3056,7 +6322,7 @@
       </w:pPr>
     </w:lvl>
   </w:abstractNum>
-  <w:abstractNum w:abstractNumId="12" w15:restartNumberingAfterBreak="0">
+  <w:abstractNum w:abstractNumId="13" w15:restartNumberingAfterBreak="0">
     <w:nsid w:val="2D6C3F58"/>
     <w:multiLevelType w:val="multilevel"/>
     <w:tmpl w:val="BF86FE5E"/>
@@ -3169,7 +6435,7 @@
       </w:pPr>
     </w:lvl>
   </w:abstractNum>
-  <w:abstractNum w:abstractNumId="13" w15:restartNumberingAfterBreak="0">
+  <w:abstractNum w:abstractNumId="14" w15:restartNumberingAfterBreak="0">
     <w:nsid w:val="2F726108"/>
     <w:multiLevelType w:val="multilevel"/>
     <w:tmpl w:val="97343D7C"/>
@@ -3318,7 +6584,124 @@
       </w:rPr>
     </w:lvl>
   </w:abstractNum>
-  <w:abstractNum w:abstractNumId="14" w15:restartNumberingAfterBreak="0">
+  <w:abstractNum w:abstractNumId="15" w15:restartNumberingAfterBreak="0">
+    <w:nsid w:val="304C0E6C"/>
+    <w:multiLevelType w:val="multilevel"/>
+    <w:tmpl w:val="CC3E0896"/>
+    <w:lvl w:ilvl="0">
+      <w:start w:val="1"/>
+      <w:numFmt w:val="decimal"/>
+      <w:lvlText w:val="%1."/>
+      <w:lvlJc w:val="left"/>
+      <w:pPr>
+        <w:tabs>
+          <w:tab w:val="num" w:pos="720"/>
+        </w:tabs>
+        <w:ind w:left="720" w:hanging="360"/>
+      </w:pPr>
+    </w:lvl>
+    <w:lvl w:ilvl="1">
+      <w:start w:val="1"/>
+      <w:numFmt w:val="bullet"/>
+      <w:lvlText w:val="o"/>
+      <w:lvlJc w:val="left"/>
+      <w:pPr>
+        <w:tabs>
+          <w:tab w:val="num" w:pos="1440"/>
+        </w:tabs>
+        <w:ind w:left="1440" w:hanging="360"/>
+      </w:pPr>
+      <w:rPr>
+        <w:rFonts w:ascii="Courier New" w:hAnsi="Courier New" w:hint="default"/>
+        <w:sz w:val="20"/>
+      </w:rPr>
+    </w:lvl>
+    <w:lvl w:ilvl="2" w:tentative="1">
+      <w:start w:val="1"/>
+      <w:numFmt w:val="decimal"/>
+      <w:lvlText w:val="%3."/>
+      <w:lvlJc w:val="left"/>
+      <w:pPr>
+        <w:tabs>
+          <w:tab w:val="num" w:pos="2160"/>
+        </w:tabs>
+        <w:ind w:left="2160" w:hanging="360"/>
+      </w:pPr>
+    </w:lvl>
+    <w:lvl w:ilvl="3" w:tentative="1">
+      <w:start w:val="1"/>
+      <w:numFmt w:val="decimal"/>
+      <w:lvlText w:val="%4."/>
+      <w:lvlJc w:val="left"/>
+      <w:pPr>
+        <w:tabs>
+          <w:tab w:val="num" w:pos="2880"/>
+        </w:tabs>
+        <w:ind w:left="2880" w:hanging="360"/>
+      </w:pPr>
+    </w:lvl>
+    <w:lvl w:ilvl="4" w:tentative="1">
+      <w:start w:val="1"/>
+      <w:numFmt w:val="decimal"/>
+      <w:lvlText w:val="%5."/>
+      <w:lvlJc w:val="left"/>
+      <w:pPr>
+        <w:tabs>
+          <w:tab w:val="num" w:pos="3600"/>
+        </w:tabs>
+        <w:ind w:left="3600" w:hanging="360"/>
+      </w:pPr>
+    </w:lvl>
+    <w:lvl w:ilvl="5" w:tentative="1">
+      <w:start w:val="1"/>
+      <w:numFmt w:val="decimal"/>
+      <w:lvlText w:val="%6."/>
+      <w:lvlJc w:val="left"/>
+      <w:pPr>
+        <w:tabs>
+          <w:tab w:val="num" w:pos="4320"/>
+        </w:tabs>
+        <w:ind w:left="4320" w:hanging="360"/>
+      </w:pPr>
+    </w:lvl>
+    <w:lvl w:ilvl="6" w:tentative="1">
+      <w:start w:val="1"/>
+      <w:numFmt w:val="decimal"/>
+      <w:lvlText w:val="%7."/>
+      <w:lvlJc w:val="left"/>
+      <w:pPr>
+        <w:tabs>
+          <w:tab w:val="num" w:pos="5040"/>
+        </w:tabs>
+        <w:ind w:left="5040" w:hanging="360"/>
+      </w:pPr>
+    </w:lvl>
+    <w:lvl w:ilvl="7" w:tentative="1">
+      <w:start w:val="1"/>
+      <w:numFmt w:val="decimal"/>
+      <w:lvlText w:val="%8."/>
+      <w:lvlJc w:val="left"/>
+      <w:pPr>
+        <w:tabs>
+          <w:tab w:val="num" w:pos="5760"/>
+        </w:tabs>
+        <w:ind w:left="5760" w:hanging="360"/>
+      </w:pPr>
+    </w:lvl>
+    <w:lvl w:ilvl="8" w:tentative="1">
+      <w:start w:val="1"/>
+      <w:numFmt w:val="decimal"/>
+      <w:lvlText w:val="%9."/>
+      <w:lvlJc w:val="left"/>
+      <w:pPr>
+        <w:tabs>
+          <w:tab w:val="num" w:pos="6480"/>
+        </w:tabs>
+        <w:ind w:left="6480" w:hanging="360"/>
+      </w:pPr>
+    </w:lvl>
+  </w:abstractNum>
+  <w:abstractNum w:abstractNumId="16" w15:restartNumberingAfterBreak="0">
     <w:nsid w:val="33157360"/>
     <w:multiLevelType w:val="multilevel"/>
     <w:tmpl w:val="FC7852B4"/>
@@ -3467,7 +6850,7 @@
       </w:rPr>
     </w:lvl>
   </w:abstractNum>
-  <w:abstractNum w:abstractNumId="15" w15:restartNumberingAfterBreak="0">
+  <w:abstractNum w:abstractNumId="17" w15:restartNumberingAfterBreak="0">
     <w:nsid w:val="359D74BD"/>
     <w:multiLevelType w:val="multilevel"/>
     <w:tmpl w:val="9E1657C2"/>
@@ -3616,7 +6999,7 @@
       </w:rPr>
     </w:lvl>
   </w:abstractNum>
-  <w:abstractNum w:abstractNumId="16" w15:restartNumberingAfterBreak="0">
+  <w:abstractNum w:abstractNumId="18" w15:restartNumberingAfterBreak="0">
     <w:nsid w:val="37376F51"/>
     <w:multiLevelType w:val="multilevel"/>
     <w:tmpl w:val="A02C2ECE"/>
@@ -3765,7 +7148,7 @@
       </w:rPr>
     </w:lvl>
   </w:abstractNum>
-  <w:abstractNum w:abstractNumId="17" w15:restartNumberingAfterBreak="0">
+  <w:abstractNum w:abstractNumId="19" w15:restartNumberingAfterBreak="0">
     <w:nsid w:val="39E00DAC"/>
     <w:multiLevelType w:val="hybridMultilevel"/>
     <w:tmpl w:val="604253A0"/>
@@ -3878,7 +7261,7 @@
       </w:rPr>
     </w:lvl>
   </w:abstractNum>
-  <w:abstractNum w:abstractNumId="18" w15:restartNumberingAfterBreak="0">
+  <w:abstractNum w:abstractNumId="20" w15:restartNumberingAfterBreak="0">
     <w:nsid w:val="413D0024"/>
     <w:multiLevelType w:val="multilevel"/>
     <w:tmpl w:val="0B0657F0"/>
@@ -4027,7 +7410,7 @@
       </w:rPr>
     </w:lvl>
   </w:abstractNum>
-  <w:abstractNum w:abstractNumId="19" w15:restartNumberingAfterBreak="0">
+  <w:abstractNum w:abstractNumId="21" w15:restartNumberingAfterBreak="0">
     <w:nsid w:val="430149D6"/>
     <w:multiLevelType w:val="multilevel"/>
     <w:tmpl w:val="C5D4E146"/>
@@ -4176,7 +7559,7 @@
       </w:rPr>
     </w:lvl>
   </w:abstractNum>
-  <w:abstractNum w:abstractNumId="20" w15:restartNumberingAfterBreak="0">
+  <w:abstractNum w:abstractNumId="22" w15:restartNumberingAfterBreak="0">
     <w:nsid w:val="464B5B7D"/>
     <w:multiLevelType w:val="hybridMultilevel"/>
     <w:tmpl w:val="E0ACDA94"/>
@@ -4265,7 +7648,7 @@
       </w:pPr>
     </w:lvl>
   </w:abstractNum>
-  <w:abstractNum w:abstractNumId="21" w15:restartNumberingAfterBreak="0">
+  <w:abstractNum w:abstractNumId="23" w15:restartNumberingAfterBreak="0">
     <w:nsid w:val="499C176C"/>
     <w:multiLevelType w:val="multilevel"/>
     <w:tmpl w:val="99A6DC54"/>
@@ -4378,7 +7761,7 @@
       </w:pPr>
     </w:lvl>
   </w:abstractNum>
-  <w:abstractNum w:abstractNumId="22" w15:restartNumberingAfterBreak="0">
+  <w:abstractNum w:abstractNumId="24" w15:restartNumberingAfterBreak="0">
     <w:nsid w:val="4D9063FC"/>
     <w:multiLevelType w:val="hybridMultilevel"/>
     <w:tmpl w:val="F320A09E"/>
@@ -4467,7 +7850,7 @@
       </w:pPr>
     </w:lvl>
   </w:abstractNum>
-  <w:abstractNum w:abstractNumId="23" w15:restartNumberingAfterBreak="0">
+  <w:abstractNum w:abstractNumId="25" w15:restartNumberingAfterBreak="0">
     <w:nsid w:val="4E5851C6"/>
     <w:multiLevelType w:val="multilevel"/>
     <w:tmpl w:val="E4F0802A"/>
@@ -4580,7 +7963,7 @@
       </w:pPr>
     </w:lvl>
   </w:abstractNum>
-  <w:abstractNum w:abstractNumId="24" w15:restartNumberingAfterBreak="0">
+  <w:abstractNum w:abstractNumId="26" w15:restartNumberingAfterBreak="0">
     <w:nsid w:val="512D5FCD"/>
     <w:multiLevelType w:val="multilevel"/>
     <w:tmpl w:val="280236E0"/>
@@ -4729,7 +8112,7 @@
       </w:rPr>
     </w:lvl>
   </w:abstractNum>
-  <w:abstractNum w:abstractNumId="25" w15:restartNumberingAfterBreak="0">
+  <w:abstractNum w:abstractNumId="27" w15:restartNumberingAfterBreak="0">
     <w:nsid w:val="5AFD5C60"/>
     <w:multiLevelType w:val="multilevel"/>
     <w:tmpl w:val="52A04AFE"/>
@@ -4842,7 +8225,7 @@
       </w:pPr>
     </w:lvl>
   </w:abstractNum>
-  <w:abstractNum w:abstractNumId="26" w15:restartNumberingAfterBreak="0">
+  <w:abstractNum w:abstractNumId="28" w15:restartNumberingAfterBreak="0">
     <w:nsid w:val="60B436A2"/>
     <w:multiLevelType w:val="multilevel"/>
     <w:tmpl w:val="487C4878"/>
@@ -4955,7 +8338,7 @@
       </w:pPr>
     </w:lvl>
   </w:abstractNum>
-  <w:abstractNum w:abstractNumId="27" w15:restartNumberingAfterBreak="0">
+  <w:abstractNum w:abstractNumId="29" w15:restartNumberingAfterBreak="0">
     <w:nsid w:val="641A7840"/>
     <w:multiLevelType w:val="multilevel"/>
     <w:tmpl w:val="E3E6AE44"/>
@@ -5104,7 +8487,124 @@
       </w:rPr>
     </w:lvl>
   </w:abstractNum>
-  <w:abstractNum w:abstractNumId="28" w15:restartNumberingAfterBreak="0">
+  <w:abstractNum w:abstractNumId="30" w15:restartNumberingAfterBreak="0">
+    <w:nsid w:val="65401BC9"/>
+    <w:multiLevelType w:val="multilevel"/>
+    <w:tmpl w:val="55A87060"/>
+    <w:lvl w:ilvl="0">
+      <w:start w:val="1"/>
+      <w:numFmt w:val="decimal"/>
+      <w:lvlText w:val="%1."/>
+      <w:lvlJc w:val="left"/>
+      <w:pPr>
+        <w:tabs>
+          <w:tab w:val="num" w:pos="720"/>
+        </w:tabs>
+        <w:ind w:left="720" w:hanging="360"/>
+      </w:pPr>
+    </w:lvl>
+    <w:lvl w:ilvl="1">
+      <w:start w:val="1"/>
+      <w:numFmt w:val="bullet"/>
+      <w:lvlText w:val="o"/>
+      <w:lvlJc w:val="left"/>
+      <w:pPr>
+        <w:tabs>
+          <w:tab w:val="num" w:pos="1440"/>
+        </w:tabs>
+        <w:ind w:left="1440" w:hanging="360"/>
+      </w:pPr>
+      <w:rPr>
+        <w:rFonts w:ascii="Courier New" w:hAnsi="Courier New" w:hint="default"/>
+        <w:sz w:val="20"/>
+      </w:rPr>
+    </w:lvl>
+    <w:lvl w:ilvl="2" w:tentative="1">
+      <w:start w:val="1"/>
+      <w:numFmt w:val="decimal"/>
+      <w:lvlText w:val="%3."/>
+      <w:lvlJc w:val="left"/>
+      <w:pPr>
+        <w:tabs>
+          <w:tab w:val="num" w:pos="2160"/>
+        </w:tabs>
+        <w:ind w:left="2160" w:hanging="360"/>
+      </w:pPr>
+    </w:lvl>
+    <w:lvl w:ilvl="3" w:tentative="1">
+      <w:start w:val="1"/>
+      <w:numFmt w:val="decimal"/>
+      <w:lvlText w:val="%4."/>
+      <w:lvlJc w:val="left"/>
+      <w:pPr>
+        <w:tabs>
+          <w:tab w:val="num" w:pos="2880"/>
+        </w:tabs>
+        <w:ind w:left="2880" w:hanging="360"/>
+      </w:pPr>
+    </w:lvl>
+    <w:lvl w:ilvl="4" w:tentative="1">
+      <w:start w:val="1"/>
+      <w:numFmt w:val="decimal"/>
+      <w:lvlText w:val="%5."/>
+      <w:lvlJc w:val="left"/>
+      <w:pPr>
+        <w:tabs>
+          <w:tab w:val="num" w:pos="3600"/>
+        </w:tabs>
+        <w:ind w:left="3600" w:hanging="360"/>
+      </w:pPr>
+    </w:lvl>
+    <w:lvl w:ilvl="5" w:tentative="1">
+      <w:start w:val="1"/>
+      <w:numFmt w:val="decimal"/>
+      <w:lvlText w:val="%6."/>
+      <w:lvlJc w:val="left"/>
+      <w:pPr>
+        <w:tabs>
+          <w:tab w:val="num" w:pos="4320"/>
+        </w:tabs>
+        <w:ind w:left="4320" w:hanging="360"/>
+      </w:pPr>
+    </w:lvl>
+    <w:lvl w:ilvl="6" w:tentative="1">
+      <w:start w:val="1"/>
+      <w:numFmt w:val="decimal"/>
+      <w:lvlText w:val="%7."/>
+      <w:lvlJc w:val="left"/>
+      <w:pPr>
+        <w:tabs>
+          <w:tab w:val="num" w:pos="5040"/>
+        </w:tabs>
+        <w:ind w:left="5040" w:hanging="360"/>
+      </w:pPr>
+    </w:lvl>
+    <w:lvl w:ilvl="7" w:tentative="1">
+      <w:start w:val="1"/>
+      <w:numFmt w:val="decimal"/>
+      <w:lvlText w:val="%8."/>
+      <w:lvlJc w:val="left"/>
+      <w:pPr>
+        <w:tabs>
+          <w:tab w:val="num" w:pos="5760"/>
+        </w:tabs>
+        <w:ind w:left="5760" w:hanging="360"/>
+      </w:pPr>
+    </w:lvl>
+    <w:lvl w:ilvl="8" w:tentative="1">
+      <w:start w:val="1"/>
+      <w:numFmt w:val="decimal"/>
+      <w:lvlText w:val="%9."/>
+      <w:lvlJc w:val="left"/>
+      <w:pPr>
+        <w:tabs>
+          <w:tab w:val="num" w:pos="6480"/>
+        </w:tabs>
+        <w:ind w:left="6480" w:hanging="360"/>
+      </w:pPr>
+    </w:lvl>
+  </w:abstractNum>
+  <w:abstractNum w:abstractNumId="31" w15:restartNumberingAfterBreak="0">
     <w:nsid w:val="69F22B6C"/>
     <w:multiLevelType w:val="multilevel"/>
     <w:tmpl w:val="358C96FC"/>
@@ -5217,7 +8717,124 @@
       </w:pPr>
     </w:lvl>
   </w:abstractNum>
-  <w:abstractNum w:abstractNumId="29" w15:restartNumberingAfterBreak="0">
+  <w:abstractNum w:abstractNumId="32" w15:restartNumberingAfterBreak="0">
+    <w:nsid w:val="6ADF44C7"/>
+    <w:multiLevelType w:val="multilevel"/>
+    <w:tmpl w:val="B6F8EF86"/>
+    <w:lvl w:ilvl="0">
+      <w:start w:val="1"/>
+      <w:numFmt w:val="decimal"/>
+      <w:lvlText w:val="%1."/>
+      <w:lvlJc w:val="left"/>
+      <w:pPr>
+        <w:tabs>
+          <w:tab w:val="num" w:pos="720"/>
+        </w:tabs>
+        <w:ind w:left="720" w:hanging="360"/>
+      </w:pPr>
+    </w:lvl>
+    <w:lvl w:ilvl="1">
+      <w:start w:val="1"/>
+      <w:numFmt w:val="bullet"/>
+      <w:lvlText w:val="o"/>
+      <w:lvlJc w:val="left"/>
+      <w:pPr>
+        <w:tabs>
+          <w:tab w:val="num" w:pos="1440"/>
+        </w:tabs>
+        <w:ind w:left="1440" w:hanging="360"/>
+      </w:pPr>
+      <w:rPr>
+        <w:rFonts w:ascii="Courier New" w:hAnsi="Courier New" w:hint="default"/>
+        <w:sz w:val="20"/>
+      </w:rPr>
+    </w:lvl>
+    <w:lvl w:ilvl="2" w:tentative="1">
+      <w:start w:val="1"/>
+      <w:numFmt w:val="decimal"/>
+      <w:lvlText w:val="%3."/>
+      <w:lvlJc w:val="left"/>
+      <w:pPr>
+        <w:tabs>
+          <w:tab w:val="num" w:pos="2160"/>
+        </w:tabs>
+        <w:ind w:left="2160" w:hanging="360"/>
+      </w:pPr>
+    </w:lvl>
+    <w:lvl w:ilvl="3" w:tentative="1">
+      <w:start w:val="1"/>
+      <w:numFmt w:val="decimal"/>
+      <w:lvlText w:val="%4."/>
+      <w:lvlJc w:val="left"/>
+      <w:pPr>
+        <w:tabs>
+          <w:tab w:val="num" w:pos="2880"/>
+        </w:tabs>
+        <w:ind w:left="2880" w:hanging="360"/>
+      </w:pPr>
+    </w:lvl>
+    <w:lvl w:ilvl="4" w:tentative="1">
+      <w:start w:val="1"/>
+      <w:numFmt w:val="decimal"/>
+      <w:lvlText w:val="%5."/>
+      <w:lvlJc w:val="left"/>
+      <w:pPr>
+        <w:tabs>
+          <w:tab w:val="num" w:pos="3600"/>
+        </w:tabs>
+        <w:ind w:left="3600" w:hanging="360"/>
+      </w:pPr>
+    </w:lvl>
+    <w:lvl w:ilvl="5" w:tentative="1">
+      <w:start w:val="1"/>
+      <w:numFmt w:val="decimal"/>
+      <w:lvlText w:val="%6."/>
+      <w:lvlJc w:val="left"/>
+      <w:pPr>
+        <w:tabs>
+          <w:tab w:val="num" w:pos="4320"/>
+        </w:tabs>
+        <w:ind w:left="4320" w:hanging="360"/>
+      </w:pPr>
+    </w:lvl>
+    <w:lvl w:ilvl="6" w:tentative="1">
+      <w:start w:val="1"/>
+      <w:numFmt w:val="decimal"/>
+      <w:lvlText w:val="%7."/>
+      <w:lvlJc w:val="left"/>
+      <w:pPr>
+        <w:tabs>
+          <w:tab w:val="num" w:pos="5040"/>
+        </w:tabs>
+        <w:ind w:left="5040" w:hanging="360"/>
+      </w:pPr>
+    </w:lvl>
+    <w:lvl w:ilvl="7" w:tentative="1">
+      <w:start w:val="1"/>
+      <w:numFmt w:val="decimal"/>
+      <w:lvlText w:val="%8."/>
+      <w:lvlJc w:val="left"/>
+      <w:pPr>
+        <w:tabs>
+          <w:tab w:val="num" w:pos="5760"/>
+        </w:tabs>
+        <w:ind w:left="5760" w:hanging="360"/>
+      </w:pPr>
+    </w:lvl>
+    <w:lvl w:ilvl="8" w:tentative="1">
+      <w:start w:val="1"/>
+      <w:numFmt w:val="decimal"/>
+      <w:lvlText w:val="%9."/>
+      <w:lvlJc w:val="left"/>
+      <w:pPr>
+        <w:tabs>
+          <w:tab w:val="num" w:pos="6480"/>
+        </w:tabs>
+        <w:ind w:left="6480" w:hanging="360"/>
+      </w:pPr>
+    </w:lvl>
+  </w:abstractNum>
+  <w:abstractNum w:abstractNumId="33" w15:restartNumberingAfterBreak="0">
     <w:nsid w:val="6DD312A9"/>
     <w:multiLevelType w:val="multilevel"/>
     <w:tmpl w:val="0F7A1DCC"/>
@@ -5366,7 +8983,7 @@
       </w:rPr>
     </w:lvl>
   </w:abstractNum>
-  <w:abstractNum w:abstractNumId="30" w15:restartNumberingAfterBreak="0">
+  <w:abstractNum w:abstractNumId="34" w15:restartNumberingAfterBreak="0">
     <w:nsid w:val="708F6212"/>
     <w:multiLevelType w:val="multilevel"/>
     <w:tmpl w:val="14E6FF76"/>
@@ -5479,7 +9096,7 @@
       </w:pPr>
     </w:lvl>
   </w:abstractNum>
-  <w:abstractNum w:abstractNumId="31" w15:restartNumberingAfterBreak="0">
+  <w:abstractNum w:abstractNumId="35" w15:restartNumberingAfterBreak="0">
     <w:nsid w:val="71731AA6"/>
     <w:multiLevelType w:val="multilevel"/>
     <w:tmpl w:val="15141DDA"/>
@@ -5628,7 +9245,7 @@
       </w:rPr>
     </w:lvl>
   </w:abstractNum>
-  <w:abstractNum w:abstractNumId="32" w15:restartNumberingAfterBreak="0">
+  <w:abstractNum w:abstractNumId="36" w15:restartNumberingAfterBreak="0">
     <w:nsid w:val="775F453B"/>
     <w:multiLevelType w:val="multilevel"/>
     <w:tmpl w:val="76DA25D0"/>
@@ -5741,7 +9358,7 @@
       </w:pPr>
     </w:lvl>
   </w:abstractNum>
-  <w:abstractNum w:abstractNumId="33" w15:restartNumberingAfterBreak="0">
+  <w:abstractNum w:abstractNumId="37" w15:restartNumberingAfterBreak="0">
     <w:nsid w:val="79656952"/>
     <w:multiLevelType w:val="multilevel"/>
     <w:tmpl w:val="93BE872A"/>
@@ -5858,7 +9475,7 @@
       </w:pPr>
     </w:lvl>
   </w:abstractNum>
-  <w:abstractNum w:abstractNumId="34" w15:restartNumberingAfterBreak="0">
+  <w:abstractNum w:abstractNumId="38" w15:restartNumberingAfterBreak="0">
     <w:nsid w:val="798B0984"/>
     <w:multiLevelType w:val="multilevel"/>
     <w:tmpl w:val="5C661C40"/>
@@ -6007,116 +9624,128 @@
       </w:rPr>
     </w:lvl>
   </w:abstractNum>
-  <w:num w:numId="1" w16cid:durableId="1297222447">
+  <w:num w:numId="1">
+    <w:abstractNumId w:val="12"/>
+  </w:num>
+  <w:num w:numId="2">
+    <w:abstractNumId w:val="36"/>
+  </w:num>
+  <w:num w:numId="3">
+    <w:abstractNumId w:val="19"/>
+  </w:num>
+  <w:num w:numId="4">
+    <w:abstractNumId w:val="24"/>
+  </w:num>
+  <w:num w:numId="5">
     <w:abstractNumId w:val="11"/>
   </w:num>
-  <w:num w:numId="2" w16cid:durableId="1742019762">
-    <w:abstractNumId w:val="32"/>
+  <w:num w:numId="6">
+    <w:abstractNumId w:val="1"/>
   </w:num>
-  <w:num w:numId="3" w16cid:durableId="1582056931">
+  <w:num w:numId="7">
+    <w:abstractNumId w:val="5"/>
+  </w:num>
+  <w:num w:numId="8">
+    <w:abstractNumId w:val="27"/>
+  </w:num>
+  <w:num w:numId="9">
+    <w:abstractNumId w:val="8"/>
+  </w:num>
+  <w:num w:numId="10">
+    <w:abstractNumId w:val="16"/>
+  </w:num>
+  <w:num w:numId="11">
+    <w:abstractNumId w:val="9"/>
+  </w:num>
+  <w:num w:numId="12">
+    <w:abstractNumId w:val="6"/>
+  </w:num>
+  <w:num w:numId="13">
+    <w:abstractNumId w:val="14"/>
+  </w:num>
+  <w:num w:numId="14">
+    <w:abstractNumId w:val="31"/>
+  </w:num>
+  <w:num w:numId="15">
+    <w:abstractNumId w:val="13"/>
+  </w:num>
+  <w:num w:numId="16">
+    <w:abstractNumId w:val="3"/>
+  </w:num>
+  <w:num w:numId="17">
+    <w:abstractNumId w:val="37"/>
+  </w:num>
+  <w:num w:numId="18">
+    <w:abstractNumId w:val="20"/>
+  </w:num>
+  <w:num w:numId="19">
+    <w:abstractNumId w:val="23"/>
+  </w:num>
+  <w:num w:numId="20">
+    <w:abstractNumId w:val="22"/>
+  </w:num>
+  <w:num w:numId="21">
+    <w:abstractNumId w:val="21"/>
+  </w:num>
+  <w:num w:numId="22">
+    <w:abstractNumId w:val="35"/>
+  </w:num>
+  <w:num w:numId="23">
+    <w:abstractNumId w:val="2"/>
+  </w:num>
+  <w:num w:numId="24">
+    <w:abstractNumId w:val="34"/>
+  </w:num>
+  <w:num w:numId="25">
+    <w:abstractNumId w:val="26"/>
+  </w:num>
+  <w:num w:numId="26">
+    <w:abstractNumId w:val="18"/>
+  </w:num>
+  <w:num w:numId="27">
+    <w:abstractNumId w:val="25"/>
+  </w:num>
+  <w:num w:numId="28">
+    <w:abstractNumId w:val="29"/>
+  </w:num>
+  <w:num w:numId="29">
+    <w:abstractNumId w:val="38"/>
+  </w:num>
+  <w:num w:numId="30">
+    <w:abstractNumId w:val="4"/>
+  </w:num>
+  <w:num w:numId="31">
+    <w:abstractNumId w:val="28"/>
+  </w:num>
+  <w:num w:numId="32">
     <w:abstractNumId w:val="17"/>
   </w:num>
-  <w:num w:numId="4" w16cid:durableId="1758406161">
-    <w:abstractNumId w:val="22"/>
-  </w:num>
-  <w:num w:numId="5" w16cid:durableId="1984651388">
+  <w:num w:numId="33">
     <w:abstractNumId w:val="10"/>
   </w:num>
-  <w:num w:numId="6" w16cid:durableId="1975594127">
+  <w:num w:numId="34">
+    <w:abstractNumId w:val="33"/>
+  </w:num>
+  <w:num w:numId="35">
+    <w:abstractNumId w:val="7"/>
+  </w:num>
+  <w:num w:numId="36">
     <w:abstractNumId w:val="0"/>
   </w:num>
-  <w:num w:numId="7" w16cid:durableId="199247789">
-    <w:abstractNumId w:val="4"/>
-  </w:num>
-  <w:num w:numId="8" w16cid:durableId="438254996">
-    <w:abstractNumId w:val="25"/>
-  </w:num>
-  <w:num w:numId="9" w16cid:durableId="334839579">
-    <w:abstractNumId w:val="7"/>
-  </w:num>
-  <w:num w:numId="10" w16cid:durableId="1030106659">
-    <w:abstractNumId w:val="14"/>
-  </w:num>
-  <w:num w:numId="11" w16cid:durableId="972515214">
-    <w:abstractNumId w:val="8"/>
-  </w:num>
-  <w:num w:numId="12" w16cid:durableId="578370137">
-    <w:abstractNumId w:val="5"/>
-  </w:num>
-  <w:num w:numId="13" w16cid:durableId="2041277272">
-    <w:abstractNumId w:val="13"/>
-  </w:num>
-  <w:num w:numId="14" w16cid:durableId="1035277857">
-    <w:abstractNumId w:val="28"/>
-  </w:num>
-  <w:num w:numId="15" w16cid:durableId="854540402">
-    <w:abstractNumId w:val="12"/>
-  </w:num>
-  <w:num w:numId="16" w16cid:durableId="469906192">
-    <w:abstractNumId w:val="2"/>
-  </w:num>
-  <w:num w:numId="17" w16cid:durableId="2131777509">
-    <w:abstractNumId w:val="33"/>
-  </w:num>
-  <w:num w:numId="18" w16cid:durableId="1739014534">
-    <w:abstractNumId w:val="18"/>
-  </w:num>
-  <w:num w:numId="19" w16cid:durableId="1063025619">
-    <w:abstractNumId w:val="21"/>
-  </w:num>
-  <w:num w:numId="20" w16cid:durableId="1995450998">
-    <w:abstractNumId w:val="20"/>
-  </w:num>
-  <w:num w:numId="21" w16cid:durableId="1543132888">
-    <w:abstractNumId w:val="19"/>
-  </w:num>
-  <w:num w:numId="22" w16cid:durableId="1434662788">
-    <w:abstractNumId w:val="31"/>
-  </w:num>
-  <w:num w:numId="23" w16cid:durableId="1704095330">
-    <w:abstractNumId w:val="1"/>
-  </w:num>
-  <w:num w:numId="24" w16cid:durableId="1957902078">
+  <w:num w:numId="37">
     <w:abstractNumId w:val="30"/>
   </w:num>
-  <w:num w:numId="25" w16cid:durableId="1611663524">
-    <w:abstractNumId w:val="24"/>
-  </w:num>
-  <w:num w:numId="26" w16cid:durableId="297758742">
-    <w:abstractNumId w:val="16"/>
-  </w:num>
-  <w:num w:numId="27" w16cid:durableId="421075289">
-    <w:abstractNumId w:val="23"/>
-  </w:num>
-  <w:num w:numId="28" w16cid:durableId="2145729909">
-    <w:abstractNumId w:val="27"/>
-  </w:num>
-  <w:num w:numId="29" w16cid:durableId="639119503">
-    <w:abstractNumId w:val="34"/>
-  </w:num>
-  <w:num w:numId="30" w16cid:durableId="2034260549">
-    <w:abstractNumId w:val="3"/>
-  </w:num>
-  <w:num w:numId="31" w16cid:durableId="1401753459">
-    <w:abstractNumId w:val="26"/>
-  </w:num>
-  <w:num w:numId="32" w16cid:durableId="243418615">
+  <w:num w:numId="38">
     <w:abstractNumId w:val="15"/>
   </w:num>
-  <w:num w:numId="33" w16cid:durableId="2107113854">
-    <w:abstractNumId w:val="9"/>
-  </w:num>
-  <w:num w:numId="34" w16cid:durableId="1223709285">
-    <w:abstractNumId w:val="29"/>
-  </w:num>
-  <w:num w:numId="35" w16cid:durableId="984317473">
-    <w:abstractNumId w:val="6"/>
+  <w:num w:numId="39">
+    <w:abstractNumId w:val="32"/>
   </w:num>
 </w:numbering>
 </file>
 
 <file path=word/styles.xml><?xml version="1.0" encoding="utf-8"?>
-<w:styles xmlns:mc="http://schemas.openxmlformats.org/markup-compatibility/2006" xmlns:r="http://schemas.openxmlformats.org/officeDocument/2006/relationships" xmlns:w="http://schemas.openxmlformats.org/wordprocessingml/2006/main" xmlns:w14="http://schemas.microsoft.com/office/word/2010/wordml" xmlns:w15="http://schemas.microsoft.com/office/word/2012/wordml" xmlns:w16cex="http://schemas.microsoft.com/office/word/2018/wordml/cex" xmlns:w16cid="http://schemas.microsoft.com/office/word/2016/wordml/cid" xmlns:w16="http://schemas.microsoft.com/office/word/2018/wordml" xmlns:w16sdtdh="http://schemas.microsoft.com/office/word/2020/wordml/sdtdatahash" xmlns:w16se="http://schemas.microsoft.com/office/word/2015/wordml/symex" mc:Ignorable="w14 w15 w16se w16cid w16 w16cex w16sdtdh">
+<w:styles xmlns:mc="http://schemas.openxmlformats.org/markup-compatibility/2006" xmlns:r="http://schemas.openxmlformats.org/officeDocument/2006/relationships" xmlns:w="http://schemas.openxmlformats.org/wordprocessingml/2006/main" xmlns:w14="http://schemas.microsoft.com/office/word/2010/wordml" xmlns:w15="http://schemas.microsoft.com/office/word/2012/wordml" xmlns:w16se="http://schemas.microsoft.com/office/word/2015/wordml/symex" mc:Ignorable="w14 w15 w16se">
   <w:docDefaults>
     <w:rPrDefault>
       <w:rPr>
@@ -6132,7 +9761,7 @@
       </w:pPr>
     </w:pPrDefault>
   </w:docDefaults>
-  <w:latentStyles w:defLockedState="0" w:defUIPriority="99" w:defSemiHidden="0" w:defUnhideWhenUsed="0" w:defQFormat="0" w:count="376">
+  <w:latentStyles w:defLockedState="0" w:defUIPriority="99" w:defSemiHidden="0" w:defUnhideWhenUsed="0" w:defQFormat="0" w:count="371">
     <w:lsdException w:name="Normal" w:uiPriority="0" w:qFormat="1"/>
     <w:lsdException w:name="heading 1" w:uiPriority="9" w:qFormat="1"/>
     <w:lsdException w:name="heading 2" w:semiHidden="1" w:uiPriority="9" w:unhideWhenUsed="1" w:qFormat="1"/>
@@ -6504,16 +10133,54 @@
     <w:lsdException w:name="List Table 5 Dark Accent 6" w:uiPriority="50"/>
     <w:lsdException w:name="List Table 6 Colorful Accent 6" w:uiPriority="51"/>
     <w:lsdException w:name="List Table 7 Colorful Accent 6" w:uiPriority="52"/>
-    <w:lsdException w:name="Mention" w:semiHidden="1" w:unhideWhenUsed="1"/>
-    <w:lsdException w:name="Smart Hyperlink" w:semiHidden="1" w:unhideWhenUsed="1"/>
-    <w:lsdException w:name="Hashtag" w:semiHidden="1" w:unhideWhenUsed="1"/>
-    <w:lsdException w:name="Unresolved Mention" w:semiHidden="1" w:unhideWhenUsed="1"/>
-    <w:lsdException w:name="Smart Link" w:semiHidden="1" w:unhideWhenUsed="1"/>
   </w:latentStyles>
   <w:style w:type="paragraph" w:default="1" w:styleId="a">
     <w:name w:val="Normal"/>
     <w:qFormat/>
     <w:rsid w:val="0021014F"/>
+  </w:style>
+  <w:style w:type="paragraph" w:styleId="3">
+    <w:name w:val="heading 3"/>
+    <w:basedOn w:val="a"/>
+    <w:link w:val="30"/>
+    <w:uiPriority w:val="9"/>
+    <w:qFormat/>
+    <w:rsid w:val="00A941FC"/>
+    <w:pPr>
+      <w:spacing w:before="100" w:beforeAutospacing="1" w:after="100" w:afterAutospacing="1" w:line="240" w:lineRule="auto"/>
+      <w:outlineLvl w:val="2"/>
+    </w:pPr>
+    <w:rPr>
+      <w:rFonts w:ascii="Times New Roman" w:eastAsia="Times New Roman" w:hAnsi="Times New Roman" w:cs="Times New Roman"/>
+      <w:b/>
+      <w:bCs/>
+      <w:sz w:val="27"/>
+      <w:szCs w:val="27"/>
+      <w:lang w:eastAsia="ru-RU"/>
+    </w:rPr>
+  </w:style>
+  <w:style w:type="paragraph" w:styleId="4">
+    <w:name w:val="heading 4"/>
+    <w:basedOn w:val="a"/>
+    <w:next w:val="a"/>
+    <w:link w:val="40"/>
+    <w:uiPriority w:val="9"/>
+    <w:semiHidden/>
+    <w:unhideWhenUsed/>
+    <w:qFormat/>
+    <w:rsid w:val="0040228A"/>
+    <w:pPr>
+      <w:keepNext/>
+      <w:keepLines/>
+      <w:spacing w:before="40" w:after="0"/>
+      <w:outlineLvl w:val="3"/>
+    </w:pPr>
+    <w:rPr>
+      <w:rFonts w:asciiTheme="majorHAnsi" w:eastAsiaTheme="majorEastAsia" w:hAnsiTheme="majorHAnsi" w:cstheme="majorBidi"/>
+      <w:i/>
+      <w:iCs/>
+      <w:color w:val="2F5496" w:themeColor="accent1" w:themeShade="BF"/>
+    </w:rPr>
   </w:style>
   <w:style w:type="character" w:default="1" w:styleId="a0">
     <w:name w:val="Default Paragraph Font"/>
@@ -6652,6 +10319,121 @@
       <w:rFonts w:ascii="Consolas" w:hAnsi="Consolas"/>
       <w:sz w:val="20"/>
       <w:szCs w:val="20"/>
+    </w:rPr>
+  </w:style>
+  <w:style w:type="character" w:customStyle="1" w:styleId="30">
+    <w:name w:val="Заголовок 3 Знак"/>
+    <w:basedOn w:val="a0"/>
+    <w:link w:val="3"/>
+    <w:uiPriority w:val="9"/>
+    <w:rsid w:val="00A941FC"/>
+    <w:rPr>
+      <w:rFonts w:ascii="Times New Roman" w:eastAsia="Times New Roman" w:hAnsi="Times New Roman" w:cs="Times New Roman"/>
+      <w:b/>
+      <w:bCs/>
+      <w:sz w:val="27"/>
+      <w:szCs w:val="27"/>
+      <w:lang w:eastAsia="ru-RU"/>
+    </w:rPr>
+  </w:style>
+  <w:style w:type="paragraph" w:customStyle="1" w:styleId="ds-markdown-paragraph">
+    <w:name w:val="ds-markdown-paragraph"/>
+    <w:basedOn w:val="a"/>
+    <w:rsid w:val="00A941FC"/>
+    <w:pPr>
+      <w:spacing w:before="100" w:beforeAutospacing="1" w:after="100" w:afterAutospacing="1" w:line="240" w:lineRule="auto"/>
+    </w:pPr>
+    <w:rPr>
+      <w:rFonts w:ascii="Times New Roman" w:eastAsia="Times New Roman" w:hAnsi="Times New Roman" w:cs="Times New Roman"/>
+      <w:sz w:val="24"/>
+      <w:szCs w:val="24"/>
+      <w:lang w:eastAsia="ru-RU"/>
+    </w:rPr>
+  </w:style>
+  <w:style w:type="character" w:styleId="a6">
+    <w:name w:val="Strong"/>
+    <w:basedOn w:val="a0"/>
+    <w:uiPriority w:val="22"/>
+    <w:qFormat/>
+    <w:rsid w:val="00A941FC"/>
+    <w:rPr>
+      <w:b/>
+      <w:bCs/>
+    </w:rPr>
+  </w:style>
+  <w:style w:type="character" w:customStyle="1" w:styleId="katex-mathml">
+    <w:name w:val="katex-mathml"/>
+    <w:basedOn w:val="a0"/>
+    <w:rsid w:val="00A941FC"/>
+  </w:style>
+  <w:style w:type="character" w:customStyle="1" w:styleId="mord">
+    <w:name w:val="mord"/>
+    <w:basedOn w:val="a0"/>
+    <w:rsid w:val="00A941FC"/>
+  </w:style>
+  <w:style w:type="character" w:customStyle="1" w:styleId="mrel">
+    <w:name w:val="mrel"/>
+    <w:basedOn w:val="a0"/>
+    <w:rsid w:val="00A941FC"/>
+  </w:style>
+  <w:style w:type="character" w:customStyle="1" w:styleId="mopen">
+    <w:name w:val="mopen"/>
+    <w:basedOn w:val="a0"/>
+    <w:rsid w:val="00A941FC"/>
+  </w:style>
+  <w:style w:type="character" w:customStyle="1" w:styleId="vlist-s">
+    <w:name w:val="vlist-s"/>
+    <w:basedOn w:val="a0"/>
+    <w:rsid w:val="00A941FC"/>
+  </w:style>
+  <w:style w:type="character" w:customStyle="1" w:styleId="mpunct">
+    <w:name w:val="mpunct"/>
+    <w:basedOn w:val="a0"/>
+    <w:rsid w:val="00A941FC"/>
+  </w:style>
+  <w:style w:type="character" w:customStyle="1" w:styleId="mclose">
+    <w:name w:val="mclose"/>
+    <w:basedOn w:val="a0"/>
+    <w:rsid w:val="00A941FC"/>
+  </w:style>
+  <w:style w:type="character" w:customStyle="1" w:styleId="mbin">
+    <w:name w:val="mbin"/>
+    <w:basedOn w:val="a0"/>
+    <w:rsid w:val="00A941FC"/>
+  </w:style>
+  <w:style w:type="character" w:customStyle="1" w:styleId="mop">
+    <w:name w:val="mop"/>
+    <w:basedOn w:val="a0"/>
+    <w:rsid w:val="00A941FC"/>
+  </w:style>
+  <w:style w:type="character" w:customStyle="1" w:styleId="minner">
+    <w:name w:val="minner"/>
+    <w:basedOn w:val="a0"/>
+    <w:rsid w:val="00A941FC"/>
+  </w:style>
+  <w:style w:type="character" w:customStyle="1" w:styleId="40">
+    <w:name w:val="Заголовок 4 Знак"/>
+    <w:basedOn w:val="a0"/>
+    <w:link w:val="4"/>
+    <w:uiPriority w:val="9"/>
+    <w:semiHidden/>
+    <w:rsid w:val="0040228A"/>
+    <w:rPr>
+      <w:rFonts w:asciiTheme="majorHAnsi" w:eastAsiaTheme="majorEastAsia" w:hAnsiTheme="majorHAnsi" w:cstheme="majorBidi"/>
+      <w:i/>
+      <w:iCs/>
+      <w:color w:val="2F5496" w:themeColor="accent1" w:themeShade="BF"/>
+    </w:rPr>
+  </w:style>
+  <w:style w:type="character" w:styleId="a7">
+    <w:name w:val="Emphasis"/>
+    <w:basedOn w:val="a0"/>
+    <w:uiPriority w:val="20"/>
+    <w:qFormat/>
+    <w:rsid w:val="0040228A"/>
+    <w:rPr>
+      <w:i/>
+      <w:iCs/>
     </w:rPr>
   </w:style>
 </w:styles>
@@ -6957,7 +10739,7 @@
 </file>
 
 <file path=customXml/itemProps1.xml><?xml version="1.0" encoding="utf-8"?>
-<ds:datastoreItem xmlns:ds="http://schemas.openxmlformats.org/officeDocument/2006/customXml" ds:itemID="{2E73A040-C5EB-4B04-981F-30198E0E512E}">
+<ds:datastoreItem xmlns:ds="http://schemas.openxmlformats.org/officeDocument/2006/customXml" ds:itemID="{74A8565D-5292-46EE-AEC4-D9FF9C6F700D}">
   <ds:schemaRefs>
     <ds:schemaRef ds:uri="http://schemas.openxmlformats.org/officeDocument/2006/bibliography"/>
   </ds:schemaRefs>

</xml_diff>